<commit_message>
Mensajero: las tres frases con fuente parcial, resueltas (Cervantes confirmada, Spurgeon como proverbio recogido, Temple con su definición completa)
Co-Authored-By: Claude Opus 5.5 <noreply@anthropic.com>
Claude-Session: https://claude.ai/code/session_012sZjyYY9ZpXrog9pNGjXta
</commit_message>
<xml_diff>
--- a/mensajero/ENTREGA_PROGRAMADOR.docx
+++ b/mensajero/ENTREGA_PROGRAMADOR.docx
@@ -4371,16 +4371,25 @@
       </w:pPr>
       <w:r>
         <w:rPr>
+          <w:strike/>
+        </w:rPr>
+        <w:t xml:space="preserve">Tres frases célebres con fuente parcial</w:t>
+      </w:r>
+      <w:r>
+        <w:t xml:space="preserve"> </w:t>
+      </w:r>
+      <w:r>
+        <w:rPr>
           <w:bCs/>
           <w:b/>
         </w:rPr>
-        <w:t xml:space="preserve">Tres frases célebres</w:t>
-      </w:r>
-      <w:r>
-        <w:t xml:space="preserve"> </w:t>
-      </w:r>
-      <w:r>
-        <w:t xml:space="preserve">con fuente parcial (Spurgeon «caracol», William Temple, Cervantes «apercebido»): confirmar o cambiar.</w:t>
+        <w:t xml:space="preserve">Resuelto el 20/10/2026:</w:t>
+      </w:r>
+      <w:r>
+        <w:t xml:space="preserve"> </w:t>
+      </w:r>
+      <w:r>
+        <w:t xml:space="preserve">Cervantes confirmada (II parte, cap. XVII); Spurgeon pasa a «Proverbio recogido por Charles H. Spurgeon»; Temple con su definición completa (autor confirmado; el libro exacto, no).</w:t>
       </w:r>
     </w:p>
     <w:bookmarkEnd w:id="39"/>

</xml_diff>

<commit_message>
Mensajero: Viernes Santo, Pascua y Navidad siguen la serie (cada locutor adapta); Temple se mantiene; documentos actualizados
Co-Authored-By: Claude Opus 5.5 <noreply@anthropic.com>
Claude-Session: https://claude.ai/code/session_012sZjyYY9ZpXrog9pNGjXta
</commit_message>
<xml_diff>
--- a/mensajero/ENTREGA_PROGRAMADOR.docx
+++ b/mensajero/ENTREGA_PROGRAMADOR.docx
@@ -466,7 +466,7 @@
               <w:jc w:val="left"/>
             </w:pPr>
             <w:r>
-              <w:t xml:space="preserve">listo; 14 cambios sugeridos esperan decisión (§11)</w:t>
+              <w:t xml:space="preserve">listo; 12 cambios sugeridos esperan decisión (§11)</w:t>
             </w:r>
           </w:p>
         </w:tc>
@@ -4243,7 +4243,7 @@
         <w:t xml:space="preserve"> </w:t>
       </w:r>
       <w:r>
-        <w:t xml:space="preserve">14 cambios sugeridos esperan la decisión de Richarh (documento «Versículos a corregir 2027»,</w:t>
+        <w:t xml:space="preserve">12 cambios sugeridos esperan la decisión de Richarh (documento «Versículos a corregir 2027»,</w:t>
       </w:r>
       <w:r>
         <w:t xml:space="preserve"> </w:t>
@@ -4283,16 +4283,25 @@
       </w:pPr>
       <w:r>
         <w:rPr>
+          <w:strike/>
+        </w:rPr>
+        <w:t xml:space="preserve">Viernes Santo, Pascua y Navidad</w:t>
+      </w:r>
+      <w:r>
+        <w:t xml:space="preserve"> </w:t>
+      </w:r>
+      <w:r>
+        <w:rPr>
           <w:bCs/>
           <w:b/>
         </w:rPr>
-        <w:t xml:space="preserve">Viernes Santo (26/3) y Pascua (28/3):</w:t>
-      </w:r>
-      <w:r>
-        <w:t xml:space="preserve"> </w:t>
-      </w:r>
-      <w:r>
-        <w:t xml:space="preserve">¿la programación acompaña la fecha o sigue la serie?</w:t>
+        <w:t xml:space="preserve">Resuelto el 20/10/2026:</w:t>
+      </w:r>
+      <w:r>
+        <w:t xml:space="preserve"> </w:t>
+      </w:r>
+      <w:r>
+        <w:t xml:space="preserve">se sigue la serie; cada locutor adapta la fecha en su preparación (sin cambios en la app ni en el contenido).</w:t>
       </w:r>
     </w:p>
     <w:p>
@@ -4389,7 +4398,7 @@
         <w:t xml:space="preserve"> </w:t>
       </w:r>
       <w:r>
-        <w:t xml:space="preserve">Cervantes confirmada (II parte, cap. XVII); Spurgeon pasa a «Proverbio recogido por Charles H. Spurgeon»; Temple con su definición completa (autor confirmado; el libro exacto, no).</w:t>
+        <w:t xml:space="preserve">Cervantes confirmada (II parte, cap. XVII); Spurgeon pasa a «Proverbio recogido por Charles H. Spurgeon»; Temple se mantiene con su definición completa (autor confirmado; el libro exacto, no).</w:t>
       </w:r>
     </w:p>
     <w:bookmarkEnd w:id="39"/>

</xml_diff>

<commit_message>
Mensajero: lectura más cómoda (títulos de contenido sin mayúsculas espaciadas, texto del guion más grande) y botón de tamaño de letra (A, A+, A++)
Co-Authored-By: Claude Opus 5.5 <noreply@anthropic.com>
Claude-Session: https://claude.ai/code/session_012sZjyYY9ZpXrog9pNGjXta
</commit_message>
<xml_diff>
--- a/mensajero/ENTREGA_PROGRAMADOR.docx
+++ b/mensajero/ENTREGA_PROGRAMADOR.docx
@@ -10,7 +10,7 @@
         <w:t xml:space="preserve">Edificando una Cultura 2027 �� Entrega al programador</w:t>
       </w:r>
     </w:p>
-    <w:bookmarkStart w:id="42" w:name="X181356b963d3dc54b69ddbfd6fcf69747ea0a7f"/>
+    <w:bookmarkStart w:id="43" w:name="X181356b963d3dc54b69ddbfd6fcf69747ea0a7f"/>
     <w:p>
       <w:pPr>
         <w:pStyle w:val="Heading1"/>
@@ -1604,7 +1604,7 @@
       </w:r>
     </w:p>
     <w:bookmarkEnd w:id="24"/>
-    <w:bookmarkStart w:id="33" w:name="la-app-de-arriba-abajo-la-terminación"/>
+    <w:bookmarkStart w:id="34" w:name="la-app-de-arriba-abajo-la-terminación"/>
     <w:p>
       <w:pPr>
         <w:pStyle w:val="Heading2"/>
@@ -2255,12 +2255,39 @@
       </w:r>
     </w:p>
     <w:bookmarkEnd w:id="30"/>
-    <w:bookmarkStart w:id="31" w:name="apariencia"/>
+    <w:bookmarkStart w:id="31" w:name="tamaño-de-letra"/>
     <w:p>
       <w:pPr>
         <w:pStyle w:val="Heading3"/>
       </w:pPr>
       <w:r>
+        <w:t xml:space="preserve">Tamaño de letra</w:t>
+      </w:r>
+    </w:p>
+    <w:p>
+      <w:pPr>
+        <w:pStyle w:val="FirstParagraph"/>
+      </w:pPr>
+      <w:r>
+        <w:t xml:space="preserve">Botón «A» junto a la fecha: Normal, Grande (115 %) y Muy grande (130 %) para el contenido (no para la ilustración), guardado en cada dispositivo (</w:t>
+      </w:r>
+      <w:r>
+        <w:rPr>
+          <w:rStyle w:val="VerbatimChar"/>
+        </w:rPr>
+        <w:t xml:space="preserve">localStorage["mensajero:letra"]</w:t>
+      </w:r>
+      <w:r>
+        <w:t xml:space="preserve">). Los títulos con contenido (subtemas, ideas del repaso) van en minúscula normal y negrita, no en mayúsculas espaciadas.</w:t>
+      </w:r>
+    </w:p>
+    <w:bookmarkEnd w:id="31"/>
+    <w:bookmarkStart w:id="32" w:name="apariencia"/>
+    <w:p>
+      <w:pPr>
+        <w:pStyle w:val="Heading3"/>
+      </w:pPr>
+      <w:r>
         <w:t xml:space="preserve">Apariencia</w:t>
       </w:r>
     </w:p>
@@ -2299,8 +2326,8 @@
         <w:t xml:space="preserve">; en claro, los dorados y colores de texto pasan a tonos legibles sobre blanco.</w:t>
       </w:r>
     </w:p>
-    <w:bookmarkEnd w:id="31"/>
-    <w:bookmarkStart w:id="32" w:name="diseño"/>
+    <w:bookmarkEnd w:id="32"/>
+    <w:bookmarkStart w:id="33" w:name="diseño"/>
     <w:p>
       <w:pPr>
         <w:pStyle w:val="Heading3"/>
@@ -2317,9 +2344,9 @@
         <w:t xml:space="preserve">Tipografía Jost (peso 400 para el texto; letra mínima de 10,5 px y la mayoría de las etiquetas en 12–13 px; contraste de todo el texto ≥ 4,5:1 en oscuro y claro, medido sobre el fondo real), Nunito para «MENSAJERO», Dancing Script para «Suena bien, hace bien». Probado a 390 px y 1280 px sin desborde horizontal. Respeta «reducir movimiento».</w:t>
       </w:r>
     </w:p>
-    <w:bookmarkEnd w:id="32"/>
     <w:bookmarkEnd w:id="33"/>
-    <w:bookmarkStart w:id="34" w:name="reglas-de-negocio"/>
+    <w:bookmarkEnd w:id="34"/>
+    <w:bookmarkStart w:id="35" w:name="reglas-de-negocio"/>
     <w:p>
       <w:pPr>
         <w:pStyle w:val="Heading2"/>
@@ -2548,8 +2575,8 @@
         <w:t xml:space="preserve">versículos RVC con permiso de la Sociedad Bíblica del Paraguay.</w:t>
       </w:r>
     </w:p>
-    <w:bookmarkEnd w:id="34"/>
-    <w:bookmarkStart w:id="35" w:name="datos-del-usuario"/>
+    <w:bookmarkEnd w:id="35"/>
+    <w:bookmarkStart w:id="36" w:name="datos-del-usuario"/>
     <w:p>
       <w:pPr>
         <w:pStyle w:val="Heading2"/>
@@ -3430,8 +3457,8 @@
         <w:t xml:space="preserve">).</w:t>
       </w:r>
     </w:p>
-    <w:bookmarkEnd w:id="35"/>
-    <w:bookmarkStart w:id="36" w:name="Xe50a985b466827d34a3862a6340ca62cb757cf7"/>
+    <w:bookmarkEnd w:id="36"/>
+    <w:bookmarkStart w:id="37" w:name="Xe50a985b466827d34a3862a6340ca62cb757cf7"/>
     <w:p>
       <w:pPr>
         <w:pStyle w:val="Heading2"/>
@@ -3813,8 +3840,8 @@
         <w:t xml:space="preserve">tiene un token de Notion escrito en el código. Revocarlo, crear uno nuevo y leerlo desde una variable de entorno. No reutilizar ese archivo.</w:t>
       </w:r>
     </w:p>
-    <w:bookmarkEnd w:id="36"/>
-    <w:bookmarkStart w:id="37" w:name="tareas-para-producción"/>
+    <w:bookmarkEnd w:id="37"/>
+    <w:bookmarkStart w:id="38" w:name="tareas-para-producción"/>
     <w:p>
       <w:pPr>
         <w:pStyle w:val="Heading2"/>
@@ -4105,8 +4132,8 @@
         <w:t xml:space="preserve">☐ Sitio en Netlify y variables de entorno.</w:t>
       </w:r>
     </w:p>
-    <w:bookmarkEnd w:id="37"/>
-    <w:bookmarkStart w:id="38" w:name="X1c70bed5ef1645ee90798d85d0bb9574259c770"/>
+    <w:bookmarkEnd w:id="38"/>
+    <w:bookmarkStart w:id="39" w:name="X1c70bed5ef1645ee90798d85d0bb9574259c770"/>
     <w:p>
       <w:pPr>
         <w:pStyle w:val="Heading2"/>
@@ -4214,8 +4241,8 @@
         <w:t xml:space="preserve">El contenido no se puede descargar sin la clave.</w:t>
       </w:r>
     </w:p>
-    <w:bookmarkEnd w:id="38"/>
-    <w:bookmarkStart w:id="39" w:name="X41c5b1a1bf74ad38e1583cba0e2159d156cb3c3"/>
+    <w:bookmarkEnd w:id="39"/>
+    <w:bookmarkStart w:id="40" w:name="X41c5b1a1bf74ad38e1583cba0e2159d156cb3c3"/>
     <w:p>
       <w:pPr>
         <w:pStyle w:val="Heading2"/>
@@ -4401,8 +4428,8 @@
         <w:t xml:space="preserve">Cervantes confirmada (II parte, cap. XVII); Spurgeon pasa a «Proverbio recogido por Charles H. Spurgeon»; Temple se mantiene con su definición completa (autor confirmado; el libro exacto, no).</w:t>
       </w:r>
     </w:p>
-    <w:bookmarkEnd w:id="39"/>
-    <w:bookmarkStart w:id="40" w:name="archivos"/>
+    <w:bookmarkEnd w:id="40"/>
+    <w:bookmarkStart w:id="41" w:name="archivos"/>
     <w:p>
       <w:pPr>
         <w:pStyle w:val="Heading2"/>
@@ -4843,8 +4870,8 @@
         </w:tc>
       </w:tr>
     </w:tbl>
-    <w:bookmarkEnd w:id="40"/>
-    <w:bookmarkStart w:id="41" w:name="depuración-hecha-antes-de-la-entrega"/>
+    <w:bookmarkEnd w:id="41"/>
+    <w:bookmarkStart w:id="42" w:name="depuración-hecha-antes-de-la-entrega"/>
     <w:p>
       <w:pPr>
         <w:pStyle w:val="Heading2"/>
@@ -4901,8 +4928,8 @@
         <w:t xml:space="preserve">Tamaño del prototipo: 928 KB, de los cuales 730 KB son el contenido del año, 92 KB la lógica, 38 KB el diseño y 60 KB los dos logos incrustados. En producción el contenido y los logos salen del HTML.</w:t>
       </w:r>
     </w:p>
-    <w:bookmarkEnd w:id="41"/>
     <w:bookmarkEnd w:id="42"/>
+    <w:bookmarkEnd w:id="43"/>
     <w:sectPr/>
   </w:body>
 </w:document>

</xml_diff>

<commit_message>
Mensajero: el tamaño de letra multiplica cada tamaño (--fz) en lugar de zoom, para que funcione en tabletas
Co-Authored-By: Claude Opus 5.5 <noreply@anthropic.com>
Claude-Session: https://claude.ai/code/session_012sZjyYY9ZpXrog9pNGjXta
</commit_message>
<xml_diff>
--- a/mensajero/ENTREGA_PROGRAMADOR.docx
+++ b/mensajero/ENTREGA_PROGRAMADOR.docx
@@ -2269,7 +2269,31 @@
         <w:pStyle w:val="FirstParagraph"/>
       </w:pPr>
       <w:r>
-        <w:t xml:space="preserve">Botón «A» junto a la fecha: Normal, Grande (115 %) y Muy grande (130 %) para el contenido (no para la ilustración), guardado en cada dispositivo (</w:t>
+        <w:t xml:space="preserve">Botón «A» junto a la fecha: Normal, Grande (115 %) y Muy grande (130 %) para el contenido (cada tamaño se multiplica por la variable</w:t>
+      </w:r>
+      <w:r>
+        <w:t xml:space="preserve"> </w:t>
+      </w:r>
+      <w:r>
+        <w:rPr>
+          <w:rStyle w:val="VerbatimChar"/>
+        </w:rPr>
+        <w:t xml:space="preserve">--fz</w:t>
+      </w:r>
+      <w:r>
+        <w:t xml:space="preserve">; no se usa</w:t>
+      </w:r>
+      <w:r>
+        <w:t xml:space="preserve"> </w:t>
+      </w:r>
+      <w:r>
+        <w:rPr>
+          <w:rStyle w:val="VerbatimChar"/>
+        </w:rPr>
+        <w:t xml:space="preserve">zoom</w:t>
+      </w:r>
+      <w:r>
+        <w:t xml:space="preserve">, que algunas tabletas ignoran) (no para la ilustración), guardado en cada dispositivo (</w:t>
       </w:r>
       <w:r>
         <w:rPr>

</xml_diff>

<commit_message>
Mensajero: experiencia más simple (desplegables con flecha visible, Mis días compacto, fecha en la tarjeta, barra de atajos corta, textos más breves, «Copiar para IA»)
Co-Authored-By: Claude Opus 5.5 <noreply@anthropic.com>
Claude-Session: https://claude.ai/code/session_012sZjyYY9ZpXrog9pNGjXta
</commit_message>
<xml_diff>
--- a/mensajero/ENTREGA_PROGRAMADOR.docx
+++ b/mensajero/ENTREGA_PROGRAMADOR.docx
@@ -10,7 +10,7 @@
         <w:t xml:space="preserve">Edificando una Cultura 2027 �� Entrega al programador</w:t>
       </w:r>
     </w:p>
-    <w:bookmarkStart w:id="43" w:name="X181356b963d3dc54b69ddbfd6fcf69747ea0a7f"/>
+    <w:bookmarkStart w:id="44" w:name="X181356b963d3dc54b69ddbfd6fcf69747ea0a7f"/>
     <w:p>
       <w:pPr>
         <w:pStyle w:val="Heading1"/>
@@ -1604,7 +1604,7 @@
       </w:r>
     </w:p>
     <w:bookmarkEnd w:id="24"/>
-    <w:bookmarkStart w:id="34" w:name="la-app-de-arriba-abajo-la-terminación"/>
+    <w:bookmarkStart w:id="35" w:name="la-app-de-arriba-abajo-la-terminación"/>
     <w:p>
       <w:pPr>
         <w:pStyle w:val="Heading2"/>
@@ -1669,7 +1669,7 @@
         <w:pStyle w:val="Compact"/>
       </w:pPr>
       <w:r>
-        <w:t xml:space="preserve">Logo, fechas de la semana y</w:t>
+        <w:t xml:space="preserve">Logo y dos botones redondos:</w:t>
       </w:r>
       <w:r>
         <w:t xml:space="preserve"> </w:t>
@@ -1679,13 +1679,29 @@
           <w:bCs/>
           <w:b/>
         </w:rPr>
-        <w:t xml:space="preserve">botón de apariencia</w:t>
-      </w:r>
-      <w:r>
-        <w:t xml:space="preserve"> </w:t>
-      </w:r>
-      <w:r>
-        <w:t xml:space="preserve">(◐ automática, ☾ oscura, ☀ clara).</w:t>
+        <w:t xml:space="preserve">A</w:t>
+      </w:r>
+      <w:r>
+        <w:t xml:space="preserve"> </w:t>
+      </w:r>
+      <w:r>
+        <w:t xml:space="preserve">(tamaño de letra) y</w:t>
+      </w:r>
+      <w:r>
+        <w:t xml:space="preserve"> </w:t>
+      </w:r>
+      <w:r>
+        <w:rPr>
+          <w:bCs/>
+          <w:b/>
+        </w:rPr>
+        <w:t xml:space="preserve">◐</w:t>
+      </w:r>
+      <w:r>
+        <w:t xml:space="preserve"> </w:t>
+      </w:r>
+      <w:r>
+        <w:t xml:space="preserve">(apariencia: automática, oscura, clara). Las fechas de la semana van en la tarjeta, junto al número de semana y el color.</w:t>
       </w:r>
     </w:p>
     <w:p>
@@ -1734,7 +1750,7 @@
         <w:pStyle w:val="FirstParagraph"/>
       </w:pPr>
       <w:r>
-        <w:t xml:space="preserve">Ficha · Mis días · Mi semana · Preparación · Registro · Marco · Año · Buscar · Útiles · Mensajero.</w:t>
+        <w:t xml:space="preserve">Ficha · Mi semana · Preparación · Registro · Buscar · Útiles (el resto se alcanza en los grupos del final).</w:t>
       </w:r>
     </w:p>
     <w:bookmarkEnd w:id="26"/>
@@ -1763,6 +1779,318 @@
       </w:pPr>
       <w:r>
         <w:t xml:space="preserve">Mis días al aire y varios programas</w:t>
+      </w:r>
+    </w:p>
+    <w:p>
+      <w:pPr>
+        <w:pStyle w:val="FirstParagraph"/>
+      </w:pPr>
+      <w:r>
+        <w:t xml:space="preserve">Una vez elegidos, la sección queda en una línea («Tu semana: lunes a viernes» y el botón «Cambiar días»); los botones de días aparecen solo al editar.</w:t>
+      </w:r>
+      <w:r>
+        <w:t xml:space="preserve"> </w:t>
+      </w:r>
+      <w:r>
+        <w:t xml:space="preserve">- El locutor marca sus días (lunes a viernes, lunes a sábado o los que elija). Un solo día = programa semanal: la tarjeta muestra introducción y resumen en un guion.</w:t>
+      </w:r>
+      <w:r>
+        <w:t xml:space="preserve"> </w:t>
+      </w:r>
+      <w:r>
+        <w:t xml:space="preserve">- Hasta</w:t>
+      </w:r>
+      <w:r>
+        <w:t xml:space="preserve"> </w:t>
+      </w:r>
+      <w:r>
+        <w:rPr>
+          <w:bCs/>
+          <w:b/>
+        </w:rPr>
+        <w:t xml:space="preserve">3 programas</w:t>
+      </w:r>
+      <w:r>
+        <w:t xml:space="preserve"> </w:t>
+      </w:r>
+      <w:r>
+        <w:t xml:space="preserve">por locutor, cada uno con su color y sus propias marcas. Los cambios de días quedan en un historial con fecha, así los días pasados no cambian.</w:t>
+      </w:r>
+    </w:p>
+    <w:bookmarkEnd w:id="28"/>
+    <w:bookmarkStart w:id="29" w:name="mi-semana-la-tarjeta-del-día"/>
+    <w:p>
+      <w:pPr>
+        <w:pStyle w:val="Heading3"/>
+      </w:pPr>
+      <w:r>
+        <w:t xml:space="preserve">Mi semana: la tarjeta del día</w:t>
+      </w:r>
+    </w:p>
+    <w:p>
+      <w:pPr>
+        <w:pStyle w:val="FirstParagraph"/>
+      </w:pPr>
+      <w:r>
+        <w:t xml:space="preserve">Pestañas por día. Cada tarjeta, en este orden:</w:t>
+      </w:r>
+      <w:r>
+        <w:t xml:space="preserve"> </w:t>
+      </w:r>
+      <w:r>
+        <w:t xml:space="preserve">1.</w:t>
+      </w:r>
+      <w:r>
+        <w:t xml:space="preserve"> </w:t>
+      </w:r>
+      <w:r>
+        <w:rPr>
+          <w:bCs/>
+          <w:b/>
+        </w:rPr>
+        <w:t xml:space="preserve">Barra del día:</w:t>
+      </w:r>
+      <w:r>
+        <w:t xml:space="preserve"> </w:t>
+      </w:r>
+      <w:r>
+        <w:t xml:space="preserve">«Al aire», En vivo / Grabado y «+ Más» (Con entrevista, Reemplazo con el programa reemplazado). Nota personal del día plegable.</w:t>
+      </w:r>
+      <w:r>
+        <w:t xml:space="preserve"> </w:t>
+      </w:r>
+      <w:r>
+        <w:t xml:space="preserve">2.</w:t>
+      </w:r>
+      <w:r>
+        <w:t xml:space="preserve"> </w:t>
+      </w:r>
+      <w:r>
+        <w:rPr>
+          <w:bCs/>
+          <w:b/>
+        </w:rPr>
+        <w:t xml:space="preserve">Subtema del día</w:t>
+      </w:r>
+      <w:r>
+        <w:t xml:space="preserve"> </w:t>
+      </w:r>
+      <w:r>
+        <w:t xml:space="preserve">y «Para el locutor» plegable (desarrollo, nota y frase célebre del subtema).</w:t>
+      </w:r>
+      <w:r>
+        <w:t xml:space="preserve"> </w:t>
+      </w:r>
+      <w:r>
+        <w:t xml:space="preserve">3.</w:t>
+      </w:r>
+      <w:r>
+        <w:t xml:space="preserve"> </w:t>
+      </w:r>
+      <w:r>
+        <w:rPr>
+          <w:bCs/>
+          <w:b/>
+        </w:rPr>
+        <w:t xml:space="preserve">Título del guion, «Dato para abrir»</w:t>
+      </w:r>
+      <w:r>
+        <w:t xml:space="preserve"> </w:t>
+      </w:r>
+      <w:r>
+        <w:t xml:space="preserve">con su fuente y</w:t>
+      </w:r>
+      <w:r>
+        <w:t xml:space="preserve"> </w:t>
+      </w:r>
+      <w:r>
+        <w:rPr>
+          <w:bCs/>
+          <w:b/>
+        </w:rPr>
+        <w:t xml:space="preserve">versículo</w:t>
+      </w:r>
+      <w:r>
+        <w:t xml:space="preserve"> </w:t>
+      </w:r>
+      <w:r>
+        <w:t xml:space="preserve">(cita y texto RVC).</w:t>
+      </w:r>
+      <w:r>
+        <w:t xml:space="preserve"> </w:t>
+      </w:r>
+      <w:r>
+        <w:t xml:space="preserve">4.</w:t>
+      </w:r>
+      <w:r>
+        <w:t xml:space="preserve"> </w:t>
+      </w:r>
+      <w:r>
+        <w:rPr>
+          <w:bCs/>
+          <w:b/>
+        </w:rPr>
+        <w:t xml:space="preserve">Tres puntos plegables</w:t>
+      </w:r>
+      <w:r>
+        <w:t xml:space="preserve"> </w:t>
+      </w:r>
+      <w:r>
+        <w:t xml:space="preserve">(número y título a la vista; adentro desarrollo, problemática y «En la práctica»). Según la</w:t>
+      </w:r>
+      <w:r>
+        <w:t xml:space="preserve"> </w:t>
+      </w:r>
+      <w:r>
+        <w:rPr>
+          <w:bCs/>
+          <w:b/>
+        </w:rPr>
+        <w:t xml:space="preserve">franja horaria</w:t>
+      </w:r>
+      <w:r>
+        <w:t xml:space="preserve"> </w:t>
+      </w:r>
+      <w:r>
+        <w:t xml:space="preserve">del programa se abre el punto que le toca: mañana → 1, mediodía y tarde → 2, noche → 3, marcado «Tu punto de hoy». Sin franja se abre el 1. Así la audiencia que escucha varios programas no oye lo mismo dos veces.</w:t>
+      </w:r>
+      <w:r>
+        <w:t xml:space="preserve"> </w:t>
+      </w:r>
+      <w:r>
+        <w:t xml:space="preserve">5.</w:t>
+      </w:r>
+      <w:r>
+        <w:t xml:space="preserve"> </w:t>
+      </w:r>
+      <w:r>
+        <w:rPr>
+          <w:bCs/>
+          <w:b/>
+        </w:rPr>
+        <w:t xml:space="preserve">Frase deportiva</w:t>
+      </w:r>
+      <w:r>
+        <w:t xml:space="preserve"> </w:t>
+      </w:r>
+      <w:r>
+        <w:t xml:space="preserve">del día (al final del contenido; el domingo, después de la historia ilustrativa).</w:t>
+      </w:r>
+      <w:r>
+        <w:t xml:space="preserve"> </w:t>
+      </w:r>
+      <w:r>
+        <w:t xml:space="preserve">6.</w:t>
+      </w:r>
+      <w:r>
+        <w:t xml:space="preserve"> </w:t>
+      </w:r>
+      <w:r>
+        <w:rPr>
+          <w:bCs/>
+          <w:b/>
+        </w:rPr>
+        <w:t xml:space="preserve">«Hacelo a tu estilo»:</w:t>
+      </w:r>
+      <w:r>
+        <w:t xml:space="preserve"> </w:t>
+      </w:r>
+      <w:r>
+        <w:t xml:space="preserve">idea central del día, dos técnicas que rotan sobre 15 y cómo hacerlo con poco tiempo.</w:t>
+      </w:r>
+      <w:r>
+        <w:t xml:space="preserve"> </w:t>
+      </w:r>
+      <w:r>
+        <w:t xml:space="preserve">7. Botones</w:t>
+      </w:r>
+      <w:r>
+        <w:t xml:space="preserve"> </w:t>
+      </w:r>
+      <w:r>
+        <w:rPr>
+          <w:bCs/>
+          <w:b/>
+        </w:rPr>
+        <w:t xml:space="preserve">Flyer</w:t>
+      </w:r>
+      <w:r>
+        <w:t xml:space="preserve"> </w:t>
+      </w:r>
+      <w:r>
+        <w:t xml:space="preserve">(imagen 1080×1350 del versículo con la escena y el color),</w:t>
+      </w:r>
+      <w:r>
+        <w:t xml:space="preserve"> </w:t>
+      </w:r>
+      <w:r>
+        <w:rPr>
+          <w:bCs/>
+          <w:b/>
+        </w:rPr>
+        <w:t xml:space="preserve">Copiar guion</w:t>
+      </w:r>
+      <w:r>
+        <w:t xml:space="preserve"> </w:t>
+      </w:r>
+      <w:r>
+        <w:t xml:space="preserve">(texto plano completo, con «← TU PUNTO DE HOY», la frase deportiva al final, las notas del día y de producción) y</w:t>
+      </w:r>
+      <w:r>
+        <w:t xml:space="preserve"> </w:t>
+      </w:r>
+      <w:r>
+        <w:rPr>
+          <w:bCs/>
+          <w:b/>
+        </w:rPr>
+        <w:t xml:space="preserve">Copiar para IA</w:t>
+      </w:r>
+      <w:r>
+        <w:t xml:space="preserve"> </w:t>
+      </w:r>
+      <w:r>
+        <w:t xml:space="preserve">(todo lo de la semana para generar un guion con IA).</w:t>
+      </w:r>
+      <w:r>
+        <w:t xml:space="preserve"> </w:t>
+      </w:r>
+      <w:r>
+        <w:t xml:space="preserve">8.</w:t>
+      </w:r>
+      <w:r>
+        <w:t xml:space="preserve"> </w:t>
+      </w:r>
+      <w:r>
+        <w:rPr>
+          <w:bCs/>
+          <w:b/>
+        </w:rPr>
+        <w:t xml:space="preserve">Mensajes de oyentes</w:t>
+      </w:r>
+      <w:r>
+        <w:t xml:space="preserve"> </w:t>
+      </w:r>
+      <w:r>
+        <w:t xml:space="preserve">(solo días en vivo): un cuadro con los logos de SMS, WhatsApp, YouTube, Instagram y Facebook. Cada toque suma 1; «Restar» y luego el logo resta 1 y se apaga solo; el número se puede escribir; arriba, el total.</w:t>
+      </w:r>
+    </w:p>
+    <w:p>
+      <w:pPr>
+        <w:pStyle w:val="BodyText"/>
+      </w:pPr>
+      <w:r>
+        <w:t xml:space="preserve">Domingo: introducción de la semana, versículo con sus 3 puntos, historia ilustrativa y frase deportiva. Sábado: repaso (dato, idea de cada subtema, acción de la semana), versículo, frase deportiva.</w:t>
+      </w:r>
+    </w:p>
+    <w:bookmarkEnd w:id="29"/>
+    <w:bookmarkStart w:id="30" w:name="grupos-del-final"/>
+    <w:p>
+      <w:pPr>
+        <w:pStyle w:val="Heading3"/>
+      </w:pPr>
+      <w:r>
+        <w:t xml:space="preserve">Grupos del final</w:t>
       </w:r>
     </w:p>
     <w:p>
@@ -1774,7 +2102,59 @@
         <w:pStyle w:val="Compact"/>
       </w:pPr>
       <w:r>
-        <w:t xml:space="preserve">El locutor marca sus días (lunes a viernes, lunes a sábado o los que elija). Un solo día = programa semanal: la tarjeta muestra introducción y resumen en un guion.</w:t>
+        <w:rPr>
+          <w:bCs/>
+          <w:b/>
+        </w:rPr>
+        <w:t xml:space="preserve">Mi trabajo:</w:t>
+      </w:r>
+      <w:r>
+        <w:t xml:space="preserve"> </w:t>
+      </w:r>
+      <w:r>
+        <w:rPr>
+          <w:iCs/>
+          <w:i/>
+        </w:rPr>
+        <w:t xml:space="preserve">Mi preparación</w:t>
+      </w:r>
+      <w:r>
+        <w:t xml:space="preserve"> </w:t>
+      </w:r>
+      <w:r>
+        <w:t xml:space="preserve">(programa: nombre, duración, modalidad y franja; lista de hasta 10 tareas elegidas de una biblioteca de 30 en cuatro grupos —Contenido 12, Producción 11, Técnica 4, Después del aire 3—; notas de producción; porcentaje),</w:t>
+      </w:r>
+      <w:r>
+        <w:t xml:space="preserve"> </w:t>
+      </w:r>
+      <w:r>
+        <w:rPr>
+          <w:iCs/>
+          <w:i/>
+        </w:rPr>
+        <w:t xml:space="preserve">Registro al aire</w:t>
+      </w:r>
+      <w:r>
+        <w:t xml:space="preserve"> </w:t>
+      </w:r>
+      <w:r>
+        <w:t xml:space="preserve">(por mes: días al aire, en vivo y grabados, entrevistas, mensajes por canal; copiar informe del mes),</w:t>
+      </w:r>
+      <w:r>
+        <w:t xml:space="preserve"> </w:t>
+      </w:r>
+      <w:r>
+        <w:rPr>
+          <w:iCs/>
+          <w:i/>
+        </w:rPr>
+        <w:t xml:space="preserve">Informe de preparación</w:t>
+      </w:r>
+      <w:r>
+        <w:t xml:space="preserve"> </w:t>
+      </w:r>
+      <w:r>
+        <w:t xml:space="preserve">(por mes, con niveles Excelente/Buena/Regular/Baja; copiar informe).</w:t>
       </w:r>
     </w:p>
     <w:p>
@@ -1786,299 +2166,247 @@
         <w:pStyle w:val="Compact"/>
       </w:pPr>
       <w:r>
-        <w:t xml:space="preserve">Hasta</w:t>
-      </w:r>
-      <w:r>
-        <w:t xml:space="preserve"> </w:t>
-      </w:r>
-      <w:r>
         <w:rPr>
           <w:bCs/>
           <w:b/>
         </w:rPr>
-        <w:t xml:space="preserve">3 programas</w:t>
-      </w:r>
-      <w:r>
-        <w:t xml:space="preserve"> </w:t>
-      </w:r>
-      <w:r>
-        <w:t xml:space="preserve">por locutor, cada uno con su color y sus propias marcas. Los cambios de días quedan en un historial con fecha, así los días pasados no cambian.</w:t>
-      </w:r>
-    </w:p>
-    <w:bookmarkEnd w:id="28"/>
-    <w:bookmarkStart w:id="29" w:name="mi-semana-la-tarjeta-del-día"/>
-    <w:p>
-      <w:pPr>
-        <w:pStyle w:val="Heading3"/>
-      </w:pPr>
-      <w:r>
-        <w:t xml:space="preserve">Mi semana: la tarjeta del día</w:t>
-      </w:r>
-    </w:p>
-    <w:p>
-      <w:pPr>
-        <w:pStyle w:val="FirstParagraph"/>
-      </w:pPr>
-      <w:r>
-        <w:t xml:space="preserve">Pestañas por día. Cada tarjeta, en este orden:</w:t>
-      </w:r>
-      <w:r>
-        <w:t xml:space="preserve"> </w:t>
-      </w:r>
-      <w:r>
-        <w:t xml:space="preserve">1.</w:t>
-      </w:r>
-      <w:r>
-        <w:t xml:space="preserve"> </w:t>
-      </w:r>
+        <w:t xml:space="preserve">La serie 2027:</w:t>
+      </w:r>
+      <w:r>
+        <w:t xml:space="preserve"> </w:t>
+      </w:r>
+      <w:r>
+        <w:rPr>
+          <w:iCs/>
+          <w:i/>
+        </w:rPr>
+        <w:t xml:space="preserve">Historia bíblica y marcos</w:t>
+      </w:r>
+      <w:r>
+        <w:t xml:space="preserve">,</w:t>
+      </w:r>
+      <w:r>
+        <w:t xml:space="preserve"> </w:t>
+      </w:r>
+      <w:r>
+        <w:rPr>
+          <w:iCs/>
+          <w:i/>
+        </w:rPr>
+        <w:t xml:space="preserve">Edificando una Cultura · 2027</w:t>
+      </w:r>
+      <w:r>
+        <w:t xml:space="preserve"> </w:t>
+      </w:r>
+      <w:r>
+        <w:t xml:space="preserve">(las 52 semanas por color con barra de días al aire),</w:t>
+      </w:r>
+      <w:r>
+        <w:t xml:space="preserve"> </w:t>
+      </w:r>
+      <w:r>
+        <w:rPr>
+          <w:iCs/>
+          <w:i/>
+        </w:rPr>
+        <w:t xml:space="preserve">Buscar</w:t>
+      </w:r>
+      <w:r>
+        <w:t xml:space="preserve"> </w:t>
+      </w:r>
+      <w:r>
+        <w:t xml:space="preserve">(sin distinguir tildes ni mayúsculas; lleva a la semana).</w:t>
+      </w:r>
+    </w:p>
+    <w:p>
+      <w:pPr>
+        <w:numPr>
+          <w:ilvl w:val="0"/>
+          <w:numId w:val="1005"/>
+        </w:numPr>
+        <w:pStyle w:val="Compact"/>
+      </w:pPr>
       <w:r>
         <w:rPr>
           <w:bCs/>
           <w:b/>
         </w:rPr>
-        <w:t xml:space="preserve">Barra del día:</w:t>
-      </w:r>
-      <w:r>
-        <w:t xml:space="preserve"> </w:t>
-      </w:r>
-      <w:r>
-        <w:t xml:space="preserve">«Al aire», En vivo / Grabado y «+ Más» (Con entrevista, Reemplazo con el programa reemplazado). Nota personal del día plegable.</w:t>
-      </w:r>
-      <w:r>
-        <w:t xml:space="preserve"> </w:t>
-      </w:r>
-      <w:r>
-        <w:t xml:space="preserve">2.</w:t>
-      </w:r>
-      <w:r>
-        <w:t xml:space="preserve"> </w:t>
-      </w:r>
-      <w:r>
-        <w:rPr>
-          <w:bCs/>
-          <w:b/>
-        </w:rPr>
-        <w:t xml:space="preserve">Subtema del día</w:t>
-      </w:r>
-      <w:r>
-        <w:t xml:space="preserve"> </w:t>
-      </w:r>
-      <w:r>
-        <w:t xml:space="preserve">y «Para el locutor» plegable (desarrollo, nota y frase célebre del subtema).</w:t>
-      </w:r>
-      <w:r>
-        <w:t xml:space="preserve"> </w:t>
-      </w:r>
-      <w:r>
-        <w:t xml:space="preserve">3.</w:t>
-      </w:r>
-      <w:r>
-        <w:t xml:space="preserve"> </w:t>
-      </w:r>
-      <w:r>
-        <w:rPr>
-          <w:bCs/>
-          <w:b/>
-        </w:rPr>
-        <w:t xml:space="preserve">Título del guion, «Dato para abrir»</w:t>
-      </w:r>
-      <w:r>
-        <w:t xml:space="preserve"> </w:t>
-      </w:r>
-      <w:r>
-        <w:t xml:space="preserve">con su fuente y</w:t>
-      </w:r>
-      <w:r>
-        <w:t xml:space="preserve"> </w:t>
-      </w:r>
-      <w:r>
-        <w:rPr>
-          <w:bCs/>
-          <w:b/>
-        </w:rPr>
-        <w:t xml:space="preserve">versículo</w:t>
-      </w:r>
-      <w:r>
-        <w:t xml:space="preserve"> </w:t>
-      </w:r>
-      <w:r>
-        <w:t xml:space="preserve">(cita y texto RVC).</w:t>
-      </w:r>
-      <w:r>
-        <w:t xml:space="preserve"> </w:t>
-      </w:r>
-      <w:r>
-        <w:t xml:space="preserve">4.</w:t>
-      </w:r>
-      <w:r>
-        <w:t xml:space="preserve"> </w:t>
-      </w:r>
-      <w:r>
-        <w:rPr>
-          <w:bCs/>
-          <w:b/>
-        </w:rPr>
-        <w:t xml:space="preserve">Tres puntos plegables</w:t>
-      </w:r>
-      <w:r>
-        <w:t xml:space="preserve"> </w:t>
-      </w:r>
-      <w:r>
-        <w:t xml:space="preserve">(número y título a la vista; adentro desarrollo, problemática y «En la práctica»). Según la</w:t>
-      </w:r>
-      <w:r>
-        <w:t xml:space="preserve"> </w:t>
-      </w:r>
-      <w:r>
-        <w:rPr>
-          <w:bCs/>
-          <w:b/>
-        </w:rPr>
-        <w:t xml:space="preserve">franja horaria</w:t>
-      </w:r>
-      <w:r>
-        <w:t xml:space="preserve"> </w:t>
-      </w:r>
-      <w:r>
-        <w:t xml:space="preserve">del programa se abre el punto que le toca: mañana → 1, mediodía y tarde → 2, noche → 3, marcado «Tu punto de hoy». Sin franja se abre el 1. Así la audiencia que escucha varios programas no oye lo mismo dos veces.</w:t>
-      </w:r>
-      <w:r>
-        <w:t xml:space="preserve"> </w:t>
-      </w:r>
-      <w:r>
-        <w:t xml:space="preserve">5.</w:t>
-      </w:r>
-      <w:r>
-        <w:t xml:space="preserve"> </w:t>
-      </w:r>
-      <w:r>
-        <w:rPr>
-          <w:bCs/>
-          <w:b/>
-        </w:rPr>
-        <w:t xml:space="preserve">Frase deportiva</w:t>
-      </w:r>
-      <w:r>
-        <w:t xml:space="preserve"> </w:t>
-      </w:r>
-      <w:r>
-        <w:t xml:space="preserve">del día (al final del contenido; el domingo, después de la historia ilustrativa).</w:t>
-      </w:r>
-      <w:r>
-        <w:t xml:space="preserve"> </w:t>
-      </w:r>
-      <w:r>
-        <w:t xml:space="preserve">6.</w:t>
-      </w:r>
-      <w:r>
-        <w:t xml:space="preserve"> </w:t>
-      </w:r>
-      <w:r>
-        <w:rPr>
-          <w:bCs/>
-          <w:b/>
-        </w:rPr>
-        <w:t xml:space="preserve">«Hacelo a tu estilo»:</w:t>
-      </w:r>
-      <w:r>
-        <w:t xml:space="preserve"> </w:t>
-      </w:r>
-      <w:r>
-        <w:t xml:space="preserve">idea central del día, dos técnicas que rotan sobre 15 y cómo hacerlo con poco tiempo.</w:t>
-      </w:r>
-      <w:r>
-        <w:t xml:space="preserve"> </w:t>
-      </w:r>
-      <w:r>
-        <w:t xml:space="preserve">7. Botones</w:t>
-      </w:r>
-      <w:r>
-        <w:t xml:space="preserve"> </w:t>
-      </w:r>
-      <w:r>
-        <w:rPr>
-          <w:bCs/>
-          <w:b/>
-        </w:rPr>
-        <w:t xml:space="preserve">Flyer</w:t>
-      </w:r>
-      <w:r>
-        <w:t xml:space="preserve"> </w:t>
-      </w:r>
-      <w:r>
-        <w:t xml:space="preserve">(imagen 1080×1350 del versículo con la escena y el color),</w:t>
-      </w:r>
-      <w:r>
-        <w:t xml:space="preserve"> </w:t>
-      </w:r>
-      <w:r>
-        <w:rPr>
-          <w:bCs/>
-          <w:b/>
-        </w:rPr>
-        <w:t xml:space="preserve">Copiar guion</w:t>
-      </w:r>
-      <w:r>
-        <w:t xml:space="preserve"> </w:t>
-      </w:r>
-      <w:r>
-        <w:t xml:space="preserve">(texto plano completo, con «← TU PUNTO DE HOY», la frase deportiva al final, las notas del día y de producción) y</w:t>
-      </w:r>
-      <w:r>
-        <w:t xml:space="preserve"> </w:t>
-      </w:r>
-      <w:r>
-        <w:rPr>
-          <w:bCs/>
-          <w:b/>
-        </w:rPr>
-        <w:t xml:space="preserve">Copiar prompt</w:t>
-      </w:r>
-      <w:r>
-        <w:t xml:space="preserve"> </w:t>
-      </w:r>
-      <w:r>
-        <w:t xml:space="preserve">(todo lo de la semana para generar un guion con IA).</w:t>
-      </w:r>
-      <w:r>
-        <w:t xml:space="preserve"> </w:t>
-      </w:r>
-      <w:r>
-        <w:t xml:space="preserve">8.</w:t>
-      </w:r>
-      <w:r>
-        <w:t xml:space="preserve"> </w:t>
-      </w:r>
-      <w:r>
-        <w:rPr>
-          <w:bCs/>
-          <w:b/>
-        </w:rPr>
-        <w:t xml:space="preserve">Mensajes de oyentes</w:t>
-      </w:r>
-      <w:r>
-        <w:t xml:space="preserve"> </w:t>
-      </w:r>
-      <w:r>
-        <w:t xml:space="preserve">(solo días en vivo): un cuadro con los logos de SMS, WhatsApp, YouTube, Instagram y Facebook. Cada toque suma 1; «Restar» y luego el logo resta 1 y se apaga solo; el número se puede escribir; arriba, el total.</w:t>
-      </w:r>
-    </w:p>
-    <w:p>
-      <w:pPr>
-        <w:pStyle w:val="BodyText"/>
-      </w:pPr>
-      <w:r>
-        <w:t xml:space="preserve">Domingo: introducción de la semana, versículo con sus 3 puntos, historia ilustrativa y frase deportiva. Sábado: repaso (dato, idea de cada subtema, acción de la semana), versículo, frase deportiva.</w:t>
-      </w:r>
-    </w:p>
-    <w:bookmarkEnd w:id="29"/>
-    <w:bookmarkStart w:id="30" w:name="grupos-del-final"/>
+        <w:t xml:space="preserve">Para la audiencia:</w:t>
+      </w:r>
+      <w:r>
+        <w:t xml:space="preserve"> </w:t>
+      </w:r>
+      <w:r>
+        <w:rPr>
+          <w:iCs/>
+          <w:i/>
+        </w:rPr>
+        <w:t xml:space="preserve">Números útiles</w:t>
+      </w:r>
+      <w:r>
+        <w:t xml:space="preserve"> </w:t>
+      </w:r>
+      <w:r>
+        <w:t xml:space="preserve">(911, 141 SEME —021 141 desde celular—, 132 Bomberos, 155 salud mental, 137 SOS Mujer y WhatsApp 0961 137 137, 147 Fono Ayuda niñez; tocar llama; copiar para leer al aire) y</w:t>
+      </w:r>
+      <w:r>
+        <w:t xml:space="preserve"> </w:t>
+      </w:r>
+      <w:r>
+        <w:rPr>
+          <w:iCs/>
+          <w:i/>
+        </w:rPr>
+        <w:t xml:space="preserve">Sobre Mensajero</w:t>
+      </w:r>
+      <w:r>
+        <w:t xml:space="preserve"> </w:t>
+      </w:r>
+      <w:r>
+        <w:t xml:space="preserve">(hoja «Mensajero»).</w:t>
+      </w:r>
+    </w:p>
+    <w:bookmarkEnd w:id="30"/>
+    <w:bookmarkStart w:id="31" w:name="tamaño-de-letra"/>
     <w:p>
       <w:pPr>
         <w:pStyle w:val="Heading3"/>
       </w:pPr>
       <w:r>
-        <w:t xml:space="preserve">Grupos del final</w:t>
+        <w:t xml:space="preserve">Tamaño de letra</w:t>
+      </w:r>
+    </w:p>
+    <w:p>
+      <w:pPr>
+        <w:pStyle w:val="FirstParagraph"/>
+      </w:pPr>
+      <w:r>
+        <w:t xml:space="preserve">Botón «A» junto a la fecha: Normal, Grande (115 %) y Muy grande (130 %) para el contenido (cada tamaño se multiplica por la variable</w:t>
+      </w:r>
+      <w:r>
+        <w:t xml:space="preserve"> </w:t>
+      </w:r>
+      <w:r>
+        <w:rPr>
+          <w:rStyle w:val="VerbatimChar"/>
+        </w:rPr>
+        <w:t xml:space="preserve">--fz</w:t>
+      </w:r>
+      <w:r>
+        <w:t xml:space="preserve">; no se usa</w:t>
+      </w:r>
+      <w:r>
+        <w:t xml:space="preserve"> </w:t>
+      </w:r>
+      <w:r>
+        <w:rPr>
+          <w:rStyle w:val="VerbatimChar"/>
+        </w:rPr>
+        <w:t xml:space="preserve">zoom</w:t>
+      </w:r>
+      <w:r>
+        <w:t xml:space="preserve">, que algunas tabletas ignoran) (no para la ilustración), guardado en cada dispositivo (</w:t>
+      </w:r>
+      <w:r>
+        <w:rPr>
+          <w:rStyle w:val="VerbatimChar"/>
+        </w:rPr>
+        <w:t xml:space="preserve">localStorage["mensajero:letra"]</w:t>
+      </w:r>
+      <w:r>
+        <w:t xml:space="preserve">). Los títulos con contenido (subtemas, ideas del repaso) van en minúscula normal y negrita, no en mayúsculas espaciadas.</w:t>
+      </w:r>
+    </w:p>
+    <w:bookmarkEnd w:id="31"/>
+    <w:bookmarkStart w:id="32" w:name="desplegables"/>
+    <w:p>
+      <w:pPr>
+        <w:pStyle w:val="Heading3"/>
+      </w:pPr>
+      <w:r>
+        <w:t xml:space="preserve">Desplegables</w:t>
+      </w:r>
+    </w:p>
+    <w:p>
+      <w:pPr>
+        <w:pStyle w:val="FirstParagraph"/>
+      </w:pPr>
+      <w:r>
+        <w:t xml:space="preserve">Todo lo que se abre lleva el mismo indicador: un círculo con una flecha a la derecha que gira al abrir (grupos del final, «Para el locutor», «Hacelo a tu estilo», los tres puntos). Los desplegables chicos («Más», «Agregar nota», «Guía interna») son botones tipo píldora con borde.</w:t>
+      </w:r>
+    </w:p>
+    <w:bookmarkEnd w:id="32"/>
+    <w:bookmarkStart w:id="33" w:name="apariencia"/>
+    <w:p>
+      <w:pPr>
+        <w:pStyle w:val="Heading3"/>
+      </w:pPr>
+      <w:r>
+        <w:t xml:space="preserve">Apariencia</w:t>
+      </w:r>
+    </w:p>
+    <w:p>
+      <w:pPr>
+        <w:pStyle w:val="FirstParagraph"/>
+      </w:pPr>
+      <w:r>
+        <w:t xml:space="preserve">Automática (oscura en el celular, clara en la computadora:</w:t>
+      </w:r>
+      <w:r>
+        <w:t xml:space="preserve"> </w:t>
+      </w:r>
+      <w:r>
+        <w:rPr>
+          <w:rStyle w:val="VerbatimChar"/>
+        </w:rPr>
+        <w:t xml:space="preserve">min-width: 900px</w:t>
+      </w:r>
+      <w:r>
+        <w:t xml:space="preserve"> </w:t>
+      </w:r>
+      <w:r>
+        <w:t xml:space="preserve">y puntero fino), oscura o clara; se guarda en cada dispositivo. La ilustración de arriba y las hojas de tema quedan siempre oscuras. Paletas de los 7 colores en el objeto</w:t>
+      </w:r>
+      <w:r>
+        <w:t xml:space="preserve"> </w:t>
+      </w:r>
+      <w:r>
+        <w:rPr>
+          <w:rStyle w:val="VerbatimChar"/>
+        </w:rPr>
+        <w:t xml:space="preserve">PAL</w:t>
+      </w:r>
+      <w:r>
+        <w:t xml:space="preserve">; en claro, los dorados y colores de texto pasan a tonos legibles sobre blanco.</w:t>
+      </w:r>
+    </w:p>
+    <w:bookmarkEnd w:id="33"/>
+    <w:bookmarkStart w:id="34" w:name="diseño"/>
+    <w:p>
+      <w:pPr>
+        <w:pStyle w:val="Heading3"/>
+      </w:pPr>
+      <w:r>
+        <w:t xml:space="preserve">Diseño</w:t>
+      </w:r>
+    </w:p>
+    <w:p>
+      <w:pPr>
+        <w:pStyle w:val="FirstParagraph"/>
+      </w:pPr>
+      <w:r>
+        <w:t xml:space="preserve">Tipografía Jost (peso 400 para el texto; letra mínima de 10,5 px y la mayoría de las etiquetas en 12–13 px; contraste de todo el texto ≥ 4,5:1 en oscuro y claro, medido sobre el fondo real), Nunito para «MENSAJERO», Dancing Script para «Suena bien, hace bien». Probado a 390 px y 1280 px sin desborde horizontal. Respeta «reducir movimiento».</w:t>
+      </w:r>
+    </w:p>
+    <w:bookmarkEnd w:id="34"/>
+    <w:bookmarkEnd w:id="35"/>
+    <w:bookmarkStart w:id="36" w:name="reglas-de-negocio"/>
+    <w:p>
+      <w:pPr>
+        <w:pStyle w:val="Heading2"/>
+      </w:pPr>
+      <w:r>
+        <w:t xml:space="preserve">6. Reglas de negocio</w:t>
       </w:r>
     </w:p>
     <w:p>
@@ -2094,55 +2422,26 @@
           <w:bCs/>
           <w:b/>
         </w:rPr>
-        <w:t xml:space="preserve">Mi trabajo:</w:t>
-      </w:r>
-      <w:r>
-        <w:t xml:space="preserve"> </w:t>
-      </w:r>
-      <w:r>
-        <w:rPr>
-          <w:iCs/>
-          <w:i/>
-        </w:rPr>
-        <w:t xml:space="preserve">Mi preparación</w:t>
-      </w:r>
-      <w:r>
-        <w:t xml:space="preserve"> </w:t>
-      </w:r>
-      <w:r>
-        <w:t xml:space="preserve">(programa: nombre, duración, modalidad y franja; lista de hasta 10 tareas elegidas de una biblioteca de 30 en cuatro grupos —Contenido 12, Producción 11, Técnica 4, Después del aire 3—; notas de producción; porcentaje),</w:t>
-      </w:r>
-      <w:r>
-        <w:t xml:space="preserve"> </w:t>
-      </w:r>
-      <w:r>
-        <w:rPr>
-          <w:iCs/>
-          <w:i/>
-        </w:rPr>
-        <w:t xml:space="preserve">Registro al aire</w:t>
-      </w:r>
-      <w:r>
-        <w:t xml:space="preserve"> </w:t>
-      </w:r>
-      <w:r>
-        <w:t xml:space="preserve">(por mes: días al aire, en vivo y grabados, entrevistas, mensajes por canal; copiar informe del mes),</w:t>
-      </w:r>
-      <w:r>
-        <w:t xml:space="preserve"> </w:t>
-      </w:r>
-      <w:r>
-        <w:rPr>
-          <w:iCs/>
-          <w:i/>
-        </w:rPr>
-        <w:t xml:space="preserve">Informe de preparación</w:t>
-      </w:r>
-      <w:r>
-        <w:t xml:space="preserve"> </w:t>
-      </w:r>
-      <w:r>
-        <w:t xml:space="preserve">(por mes, con niveles Excelente/Buena/Regular/Baja; copiar informe).</w:t>
+        <w:t xml:space="preserve">Semanas</w:t>
+      </w:r>
+      <w:r>
+        <w:t xml:space="preserve"> </w:t>
+      </w:r>
+      <w:r>
+        <w:t xml:space="preserve">de domingo a sábado; la 1 empieza el</w:t>
+      </w:r>
+      <w:r>
+        <w:t xml:space="preserve"> </w:t>
+      </w:r>
+      <w:r>
+        <w:rPr>
+          <w:bCs/>
+          <w:b/>
+        </w:rPr>
+        <w:t xml:space="preserve">3 de enero de 2027</w:t>
+      </w:r>
+      <w:r>
+        <w:t xml:space="preserve">. «Esta semana» contiene la fecha de hoy; antes del 3 de enero se abre la semana 1.</w:t>
       </w:r>
     </w:p>
     <w:p>
@@ -2158,52 +2457,13 @@
           <w:bCs/>
           <w:b/>
         </w:rPr>
-        <w:t xml:space="preserve">La serie 2027:</w:t>
-      </w:r>
-      <w:r>
-        <w:t xml:space="preserve"> </w:t>
-      </w:r>
-      <w:r>
-        <w:rPr>
-          <w:iCs/>
-          <w:i/>
-        </w:rPr>
-        <w:t xml:space="preserve">Historia bíblica y marcos</w:t>
-      </w:r>
-      <w:r>
-        <w:t xml:space="preserve">,</w:t>
-      </w:r>
-      <w:r>
-        <w:t xml:space="preserve"> </w:t>
-      </w:r>
-      <w:r>
-        <w:rPr>
-          <w:iCs/>
-          <w:i/>
-        </w:rPr>
-        <w:t xml:space="preserve">Edificando una Cultura · 2027</w:t>
-      </w:r>
-      <w:r>
-        <w:t xml:space="preserve"> </w:t>
-      </w:r>
-      <w:r>
-        <w:t xml:space="preserve">(las 52 semanas por color con barra de días al aire),</w:t>
-      </w:r>
-      <w:r>
-        <w:t xml:space="preserve"> </w:t>
-      </w:r>
-      <w:r>
-        <w:rPr>
-          <w:iCs/>
-          <w:i/>
-        </w:rPr>
-        <w:t xml:space="preserve">Buscar</w:t>
-      </w:r>
-      <w:r>
-        <w:t xml:space="preserve"> </w:t>
-      </w:r>
-      <w:r>
-        <w:t xml:space="preserve">(sin distinguir tildes ni mayúsculas; lleva a la semana).</w:t>
+        <w:t xml:space="preserve">Color y tema</w:t>
+      </w:r>
+      <w:r>
+        <w:t xml:space="preserve"> </w:t>
+      </w:r>
+      <w:r>
+        <w:t xml:space="preserve">salen de la planilla; no se calculan.</w:t>
       </w:r>
     </w:p>
     <w:p>
@@ -2219,171 +2479,42 @@
           <w:bCs/>
           <w:b/>
         </w:rPr>
-        <w:t xml:space="preserve">Para la audiencia:</w:t>
-      </w:r>
-      <w:r>
-        <w:t xml:space="preserve"> </w:t>
-      </w:r>
-      <w:r>
-        <w:rPr>
-          <w:iCs/>
-          <w:i/>
-        </w:rPr>
-        <w:t xml:space="preserve">Números útiles</w:t>
-      </w:r>
-      <w:r>
-        <w:t xml:space="preserve"> </w:t>
-      </w:r>
-      <w:r>
-        <w:t xml:space="preserve">(911, 141 SEME —021 141 desde celular—, 132 Bomberos, 155 salud mental, 137 SOS Mujer y WhatsApp 0961 137 137, 147 Fono Ayuda niñez; tocar llama; copiar para leer al aire) y</w:t>
-      </w:r>
-      <w:r>
-        <w:t xml:space="preserve"> </w:t>
-      </w:r>
-      <w:r>
-        <w:rPr>
-          <w:iCs/>
-          <w:i/>
-        </w:rPr>
-        <w:t xml:space="preserve">Sobre Mensajero</w:t>
-      </w:r>
-      <w:r>
-        <w:t xml:space="preserve"> </w:t>
-      </w:r>
-      <w:r>
-        <w:t xml:space="preserve">(hoja «Mensajero»).</w:t>
-      </w:r>
-    </w:p>
-    <w:bookmarkEnd w:id="30"/>
-    <w:bookmarkStart w:id="31" w:name="tamaño-de-letra"/>
-    <w:p>
-      <w:pPr>
-        <w:pStyle w:val="Heading3"/>
-      </w:pPr>
-      <w:r>
-        <w:t xml:space="preserve">Tamaño de letra</w:t>
-      </w:r>
-    </w:p>
-    <w:p>
-      <w:pPr>
-        <w:pStyle w:val="FirstParagraph"/>
-      </w:pPr>
-      <w:r>
-        <w:t xml:space="preserve">Botón «A» junto a la fecha: Normal, Grande (115 %) y Muy grande (130 %) para el contenido (cada tamaño se multiplica por la variable</w:t>
-      </w:r>
-      <w:r>
-        <w:t xml:space="preserve"> </w:t>
-      </w:r>
-      <w:r>
-        <w:rPr>
-          <w:rStyle w:val="VerbatimChar"/>
-        </w:rPr>
-        <w:t xml:space="preserve">--fz</w:t>
-      </w:r>
-      <w:r>
-        <w:t xml:space="preserve">; no se usa</w:t>
-      </w:r>
-      <w:r>
-        <w:t xml:space="preserve"> </w:t>
-      </w:r>
-      <w:r>
-        <w:rPr>
-          <w:rStyle w:val="VerbatimChar"/>
-        </w:rPr>
-        <w:t xml:space="preserve">zoom</w:t>
-      </w:r>
-      <w:r>
-        <w:t xml:space="preserve">, que algunas tabletas ignoran) (no para la ilustración), guardado en cada dispositivo (</w:t>
-      </w:r>
-      <w:r>
-        <w:rPr>
-          <w:rStyle w:val="VerbatimChar"/>
-        </w:rPr>
-        <w:t xml:space="preserve">localStorage["mensajero:letra"]</w:t>
-      </w:r>
-      <w:r>
-        <w:t xml:space="preserve">). Los títulos con contenido (subtemas, ideas del repaso) van en minúscula normal y negrita, no en mayúsculas espaciadas.</w:t>
-      </w:r>
-    </w:p>
-    <w:bookmarkEnd w:id="31"/>
-    <w:bookmarkStart w:id="32" w:name="apariencia"/>
-    <w:p>
-      <w:pPr>
-        <w:pStyle w:val="Heading3"/>
-      </w:pPr>
-      <w:r>
-        <w:t xml:space="preserve">Apariencia</w:t>
-      </w:r>
-    </w:p>
-    <w:p>
-      <w:pPr>
-        <w:pStyle w:val="FirstParagraph"/>
-      </w:pPr>
-      <w:r>
-        <w:t xml:space="preserve">Automática (oscura en el celular, clara en la computadora:</w:t>
-      </w:r>
-      <w:r>
-        <w:t xml:space="preserve"> </w:t>
-      </w:r>
-      <w:r>
-        <w:rPr>
-          <w:rStyle w:val="VerbatimChar"/>
-        </w:rPr>
-        <w:t xml:space="preserve">min-width: 900px</w:t>
-      </w:r>
-      <w:r>
-        <w:t xml:space="preserve"> </w:t>
-      </w:r>
-      <w:r>
-        <w:t xml:space="preserve">y puntero fino), oscura o clara; se guarda en cada dispositivo. La ilustración de arriba y las hojas de tema quedan siempre oscuras. Paletas de los 7 colores en el objeto</w:t>
-      </w:r>
-      <w:r>
-        <w:t xml:space="preserve"> </w:t>
-      </w:r>
-      <w:r>
-        <w:rPr>
-          <w:rStyle w:val="VerbatimChar"/>
-        </w:rPr>
-        <w:t xml:space="preserve">PAL</w:t>
-      </w:r>
-      <w:r>
-        <w:t xml:space="preserve">; en claro, los dorados y colores de texto pasan a tonos legibles sobre blanco.</w:t>
-      </w:r>
-    </w:p>
-    <w:bookmarkEnd w:id="32"/>
-    <w:bookmarkStart w:id="33" w:name="diseño"/>
-    <w:p>
-      <w:pPr>
-        <w:pStyle w:val="Heading3"/>
-      </w:pPr>
-      <w:r>
-        <w:t xml:space="preserve">Diseño</w:t>
-      </w:r>
-    </w:p>
-    <w:p>
-      <w:pPr>
-        <w:pStyle w:val="FirstParagraph"/>
-      </w:pPr>
-      <w:r>
-        <w:t xml:space="preserve">Tipografía Jost (peso 400 para el texto; letra mínima de 10,5 px y la mayoría de las etiquetas en 12–13 px; contraste de todo el texto ≥ 4,5:1 en oscuro y claro, medido sobre el fondo real), Nunito para «MENSAJERO», Dancing Script para «Suena bien, hace bien». Probado a 390 px y 1280 px sin desborde horizontal. Respeta «reducir movimiento».</w:t>
-      </w:r>
-    </w:p>
-    <w:bookmarkEnd w:id="33"/>
-    <w:bookmarkEnd w:id="34"/>
-    <w:bookmarkStart w:id="35" w:name="reglas-de-negocio"/>
-    <w:p>
-      <w:pPr>
-        <w:pStyle w:val="Heading2"/>
-      </w:pPr>
-      <w:r>
-        <w:t xml:space="preserve">6. Reglas de negocio</w:t>
+        <w:t xml:space="preserve">Plazo de marcación:</w:t>
+      </w:r>
+      <w:r>
+        <w:t xml:space="preserve"> </w:t>
+      </w:r>
+      <w:r>
+        <w:t xml:space="preserve">la semana N se marca durante esa semana y la siguiente; al empezar la N+2 queda</w:t>
+      </w:r>
+      <w:r>
+        <w:t xml:space="preserve"> </w:t>
+      </w:r>
+      <w:r>
+        <w:rPr>
+          <w:bCs/>
+          <w:b/>
+        </w:rPr>
+        <w:t xml:space="preserve">cerrada</w:t>
+      </w:r>
+      <w:r>
+        <w:t xml:space="preserve">. Coordinación la abre con su clave y cada apertura queda registrada con fecha (</w:t>
+      </w:r>
+      <w:r>
+        <w:rPr>
+          <w:rStyle w:val="VerbatimChar"/>
+        </w:rPr>
+        <w:t xml:space="preserve">AAAA/wN/correccion</w:t>
+      </w:r>
+      <w:r>
+        <w:t xml:space="preserve">). Con la semana cerrada, ninguna marca, nota ni mensaje se puede cambiar.</w:t>
       </w:r>
     </w:p>
     <w:p>
       <w:pPr>
         <w:numPr>
           <w:ilvl w:val="0"/>
-          <w:numId w:val="1007"/>
+          <w:numId w:val="1006"/>
         </w:numPr>
         <w:pStyle w:val="Compact"/>
       </w:pPr>
@@ -2392,33 +2523,42 @@
           <w:bCs/>
           <w:b/>
         </w:rPr>
-        <w:t xml:space="preserve">Semanas</w:t>
-      </w:r>
-      <w:r>
-        <w:t xml:space="preserve"> </w:t>
-      </w:r>
-      <w:r>
-        <w:t xml:space="preserve">de domingo a sábado; la 1 empieza el</w:t>
-      </w:r>
-      <w:r>
-        <w:t xml:space="preserve"> </w:t>
-      </w:r>
+        <w:t xml:space="preserve">Modalidad:</w:t>
+      </w:r>
+      <w:r>
+        <w:t xml:space="preserve"> </w:t>
+      </w:r>
+      <w:r>
+        <w:t xml:space="preserve">cada programa tiene una por defecto (En vivo / Siempre grabado) y cada día puede cambiarla. Al marcar «Al aire» o un mensaje, la modalidad de ese día queda fija aunque después cambie la del programa.</w:t>
+      </w:r>
+    </w:p>
+    <w:p>
+      <w:pPr>
+        <w:numPr>
+          <w:ilvl w:val="0"/>
+          <w:numId w:val="1006"/>
+        </w:numPr>
+        <w:pStyle w:val="Compact"/>
+      </w:pPr>
       <w:r>
         <w:rPr>
           <w:bCs/>
           <w:b/>
         </w:rPr>
-        <w:t xml:space="preserve">3 de enero de 2027</w:t>
-      </w:r>
-      <w:r>
-        <w:t xml:space="preserve">. «Esta semana» contiene la fecha de hoy; antes del 3 de enero se abre la semana 1.</w:t>
+        <w:t xml:space="preserve">Registro mensual:</w:t>
+      </w:r>
+      <w:r>
+        <w:t xml:space="preserve"> </w:t>
+      </w:r>
+      <w:r>
+        <w:t xml:space="preserve">un día al aire cuenta en el mes de su fecha. Muestra días al aire sobre días del mes, en vivo y grabados, entrevistas y mensajes por canal (solo si hubo). Los informes copiados terminan con «MENSAJES DE OYENTES».</w:t>
       </w:r>
     </w:p>
     <w:p>
       <w:pPr>
         <w:numPr>
           <w:ilvl w:val="0"/>
-          <w:numId w:val="1007"/>
+          <w:numId w:val="1006"/>
         </w:numPr>
         <w:pStyle w:val="Compact"/>
       </w:pPr>
@@ -2427,20 +2567,29 @@
           <w:bCs/>
           <w:b/>
         </w:rPr>
-        <w:t xml:space="preserve">Color y tema</w:t>
-      </w:r>
-      <w:r>
-        <w:t xml:space="preserve"> </w:t>
-      </w:r>
-      <w:r>
-        <w:t xml:space="preserve">salen de la planilla; no se calculan.</w:t>
+        <w:t xml:space="preserve">Preparación:</w:t>
+      </w:r>
+      <w:r>
+        <w:t xml:space="preserve"> </w:t>
+      </w:r>
+      <w:r>
+        <w:t xml:space="preserve">la lista que regía al marcar una semana se guarda con la semana (</w:t>
+      </w:r>
+      <w:r>
+        <w:rPr>
+          <w:rStyle w:val="VerbatimChar"/>
+        </w:rPr>
+        <w:t xml:space="preserve">prepLista</w:t>
+      </w:r>
+      <w:r>
+        <w:t xml:space="preserve">), así cambiar la lista no altera semanas pasadas. Las tareas de «Contenido» y los reemplazos son del locutor (sin prefijo de programa).</w:t>
       </w:r>
     </w:p>
     <w:p>
       <w:pPr>
         <w:numPr>
           <w:ilvl w:val="0"/>
-          <w:numId w:val="1007"/>
+          <w:numId w:val="1006"/>
         </w:numPr>
         <w:pStyle w:val="Compact"/>
       </w:pPr>
@@ -2449,147 +2598,28 @@
           <w:bCs/>
           <w:b/>
         </w:rPr>
-        <w:t xml:space="preserve">Plazo de marcación:</w:t>
-      </w:r>
-      <w:r>
-        <w:t xml:space="preserve"> </w:t>
-      </w:r>
-      <w:r>
-        <w:t xml:space="preserve">la semana N se marca durante esa semana y la siguiente; al empezar la N+2 queda</w:t>
-      </w:r>
-      <w:r>
-        <w:t xml:space="preserve"> </w:t>
-      </w:r>
+        <w:t xml:space="preserve">Un punto por programa</w:t>
+      </w:r>
+      <w:r>
+        <w:t xml:space="preserve"> </w:t>
+      </w:r>
+      <w:r>
+        <w:t xml:space="preserve">según la franja (ver §5).</w:t>
+      </w:r>
+    </w:p>
+    <w:p>
+      <w:pPr>
+        <w:numPr>
+          <w:ilvl w:val="0"/>
+          <w:numId w:val="1006"/>
+        </w:numPr>
+        <w:pStyle w:val="Compact"/>
+      </w:pPr>
       <w:r>
         <w:rPr>
           <w:bCs/>
           <w:b/>
         </w:rPr>
-        <w:t xml:space="preserve">cerrada</w:t>
-      </w:r>
-      <w:r>
-        <w:t xml:space="preserve">. Coordinación la abre con su clave y cada apertura queda registrada con fecha (</w:t>
-      </w:r>
-      <w:r>
-        <w:rPr>
-          <w:rStyle w:val="VerbatimChar"/>
-        </w:rPr>
-        <w:t xml:space="preserve">AAAA/wN/correccion</w:t>
-      </w:r>
-      <w:r>
-        <w:t xml:space="preserve">). Con la semana cerrada, ninguna marca, nota ni mensaje se puede cambiar.</w:t>
-      </w:r>
-    </w:p>
-    <w:p>
-      <w:pPr>
-        <w:numPr>
-          <w:ilvl w:val="0"/>
-          <w:numId w:val="1007"/>
-        </w:numPr>
-        <w:pStyle w:val="Compact"/>
-      </w:pPr>
-      <w:r>
-        <w:rPr>
-          <w:bCs/>
-          <w:b/>
-        </w:rPr>
-        <w:t xml:space="preserve">Modalidad:</w:t>
-      </w:r>
-      <w:r>
-        <w:t xml:space="preserve"> </w:t>
-      </w:r>
-      <w:r>
-        <w:t xml:space="preserve">cada programa tiene una por defecto (En vivo / Siempre grabado) y cada día puede cambiarla. Al marcar «Al aire» o un mensaje, la modalidad de ese día queda fija aunque después cambie la del programa.</w:t>
-      </w:r>
-    </w:p>
-    <w:p>
-      <w:pPr>
-        <w:numPr>
-          <w:ilvl w:val="0"/>
-          <w:numId w:val="1007"/>
-        </w:numPr>
-        <w:pStyle w:val="Compact"/>
-      </w:pPr>
-      <w:r>
-        <w:rPr>
-          <w:bCs/>
-          <w:b/>
-        </w:rPr>
-        <w:t xml:space="preserve">Registro mensual:</w:t>
-      </w:r>
-      <w:r>
-        <w:t xml:space="preserve"> </w:t>
-      </w:r>
-      <w:r>
-        <w:t xml:space="preserve">un día al aire cuenta en el mes de su fecha. Muestra días al aire sobre días del mes, en vivo y grabados, entrevistas y mensajes por canal (solo si hubo). Los informes copiados terminan con «MENSAJES DE OYENTES».</w:t>
-      </w:r>
-    </w:p>
-    <w:p>
-      <w:pPr>
-        <w:numPr>
-          <w:ilvl w:val="0"/>
-          <w:numId w:val="1007"/>
-        </w:numPr>
-        <w:pStyle w:val="Compact"/>
-      </w:pPr>
-      <w:r>
-        <w:rPr>
-          <w:bCs/>
-          <w:b/>
-        </w:rPr>
-        <w:t xml:space="preserve">Preparación:</w:t>
-      </w:r>
-      <w:r>
-        <w:t xml:space="preserve"> </w:t>
-      </w:r>
-      <w:r>
-        <w:t xml:space="preserve">la lista que regía al marcar una semana se guarda con la semana (</w:t>
-      </w:r>
-      <w:r>
-        <w:rPr>
-          <w:rStyle w:val="VerbatimChar"/>
-        </w:rPr>
-        <w:t xml:space="preserve">prepLista</w:t>
-      </w:r>
-      <w:r>
-        <w:t xml:space="preserve">), así cambiar la lista no altera semanas pasadas. Las tareas de «Contenido» y los reemplazos son del locutor (sin prefijo de programa).</w:t>
-      </w:r>
-    </w:p>
-    <w:p>
-      <w:pPr>
-        <w:numPr>
-          <w:ilvl w:val="0"/>
-          <w:numId w:val="1007"/>
-        </w:numPr>
-        <w:pStyle w:val="Compact"/>
-      </w:pPr>
-      <w:r>
-        <w:rPr>
-          <w:bCs/>
-          <w:b/>
-        </w:rPr>
-        <w:t xml:space="preserve">Un punto por programa</w:t>
-      </w:r>
-      <w:r>
-        <w:t xml:space="preserve"> </w:t>
-      </w:r>
-      <w:r>
-        <w:t xml:space="preserve">según la franja (ver §5).</w:t>
-      </w:r>
-    </w:p>
-    <w:p>
-      <w:pPr>
-        <w:numPr>
-          <w:ilvl w:val="0"/>
-          <w:numId w:val="1007"/>
-        </w:numPr>
-        <w:pStyle w:val="Compact"/>
-      </w:pPr>
-      <w:r>
-        <w:rPr>
-          <w:bCs/>
-          <w:b/>
-        </w:rPr>
         <w:t xml:space="preserve">Contenido protegido:</w:t>
       </w:r>
       <w:r>
@@ -2599,8 +2629,8 @@
         <w:t xml:space="preserve">versículos RVC con permiso de la Sociedad Bíblica del Paraguay.</w:t>
       </w:r>
     </w:p>
-    <w:bookmarkEnd w:id="35"/>
-    <w:bookmarkStart w:id="36" w:name="datos-del-usuario"/>
+    <w:bookmarkEnd w:id="36"/>
+    <w:bookmarkStart w:id="37" w:name="datos-del-usuario"/>
     <w:p>
       <w:pPr>
         <w:pStyle w:val="Heading2"/>
@@ -3481,8 +3511,8 @@
         <w:t xml:space="preserve">).</w:t>
       </w:r>
     </w:p>
-    <w:bookmarkEnd w:id="36"/>
-    <w:bookmarkStart w:id="37" w:name="Xe50a985b466827d34a3862a6340ca62cb757cf7"/>
+    <w:bookmarkEnd w:id="37"/>
+    <w:bookmarkStart w:id="38" w:name="Xe50a985b466827d34a3862a6340ca62cb757cf7"/>
     <w:p>
       <w:pPr>
         <w:pStyle w:val="Heading2"/>
@@ -3607,6 +3637,271 @@
           <w:rStyle w:val="VerbatimChar"/>
         </w:rPr>
         <w:t xml:space="preserve">  tools/ · content/ · tests/</w:t>
+      </w:r>
+    </w:p>
+    <w:p>
+      <w:pPr>
+        <w:numPr>
+          <w:ilvl w:val="0"/>
+          <w:numId w:val="1007"/>
+        </w:numPr>
+        <w:pStyle w:val="Compact"/>
+      </w:pPr>
+      <w:r>
+        <w:rPr>
+          <w:bCs/>
+          <w:b/>
+        </w:rPr>
+        <w:t xml:space="preserve">El contenido no va en</w:t>
+      </w:r>
+      <w:r>
+        <w:rPr>
+          <w:bCs/>
+          <w:b/>
+        </w:rPr>
+        <w:t xml:space="preserve"> </w:t>
+      </w:r>
+      <w:r>
+        <w:rPr>
+          <w:rStyle w:val="VerbatimChar"/>
+          <w:bCs/>
+          <w:b/>
+        </w:rPr>
+        <w:t xml:space="preserve">public/</w:t>
+      </w:r>
+      <w:r>
+        <w:rPr>
+          <w:bCs/>
+          <w:b/>
+        </w:rPr>
+        <w:t xml:space="preserve">:</w:t>
+      </w:r>
+      <w:r>
+        <w:t xml:space="preserve"> </w:t>
+      </w:r>
+      <w:r>
+        <w:t xml:space="preserve">solo por</w:t>
+      </w:r>
+      <w:r>
+        <w:t xml:space="preserve"> </w:t>
+      </w:r>
+      <w:r>
+        <w:rPr>
+          <w:rStyle w:val="VerbatimChar"/>
+        </w:rPr>
+        <w:t xml:space="preserve">/api/content</w:t>
+      </w:r>
+      <w:r>
+        <w:t xml:space="preserve"> </w:t>
+      </w:r>
+      <w:r>
+        <w:t xml:space="preserve">con clave; la app lo guarda en el dispositivo para usar sin conexión.</w:t>
+      </w:r>
+    </w:p>
+    <w:p>
+      <w:pPr>
+        <w:numPr>
+          <w:ilvl w:val="0"/>
+          <w:numId w:val="1007"/>
+        </w:numPr>
+        <w:pStyle w:val="Compact"/>
+      </w:pPr>
+      <w:r>
+        <w:rPr>
+          <w:bCs/>
+          <w:b/>
+        </w:rPr>
+        <w:t xml:space="preserve">Claves en variables de entorno</w:t>
+      </w:r>
+      <w:r>
+        <w:t xml:space="preserve"> </w:t>
+      </w:r>
+      <w:r>
+        <w:t xml:space="preserve">(por ejemplo</w:t>
+      </w:r>
+      <w:r>
+        <w:t xml:space="preserve"> </w:t>
+      </w:r>
+      <w:r>
+        <w:rPr>
+          <w:rStyle w:val="VerbatimChar"/>
+        </w:rPr>
+        <w:t xml:space="preserve">MENSAJERO_KEY</w:t>
+      </w:r>
+      <w:r>
+        <w:t xml:space="preserve">, cabecera</w:t>
+      </w:r>
+      <w:r>
+        <w:t xml:space="preserve"> </w:t>
+      </w:r>
+      <w:r>
+        <w:rPr>
+          <w:rStyle w:val="VerbatimChar"/>
+        </w:rPr>
+        <w:t xml:space="preserve">x-mensajero-key</w:t>
+      </w:r>
+      <w:r>
+        <w:t xml:space="preserve">). La</w:t>
+      </w:r>
+      <w:r>
+        <w:t xml:space="preserve"> </w:t>
+      </w:r>
+      <w:r>
+        <w:rPr>
+          <w:bCs/>
+          <w:b/>
+        </w:rPr>
+        <w:t xml:space="preserve">clave de coordinación</w:t>
+      </w:r>
+      <w:r>
+        <w:t xml:space="preserve"> </w:t>
+      </w:r>
+      <w:r>
+        <w:t xml:space="preserve">hoy está escrita en el código (</w:t>
+      </w:r>
+      <w:r>
+        <w:rPr>
+          <w:rStyle w:val="VerbatimChar"/>
+        </w:rPr>
+        <w:t xml:space="preserve">CLAVE_COORD</w:t>
+      </w:r>
+      <w:r>
+        <w:t xml:space="preserve">, provisoria) y debe pasar al servidor.</w:t>
+      </w:r>
+    </w:p>
+    <w:p>
+      <w:pPr>
+        <w:numPr>
+          <w:ilvl w:val="0"/>
+          <w:numId w:val="1007"/>
+        </w:numPr>
+        <w:pStyle w:val="Compact"/>
+      </w:pPr>
+      <w:r>
+        <w:rPr>
+          <w:rStyle w:val="VerbatimChar"/>
+        </w:rPr>
+        <w:t xml:space="preserve">build_data.py</w:t>
+      </w:r>
+      <w:r>
+        <w:t xml:space="preserve"> </w:t>
+      </w:r>
+      <w:r>
+        <w:t xml:space="preserve">debe escribir</w:t>
+      </w:r>
+      <w:r>
+        <w:t xml:space="preserve"> </w:t>
+      </w:r>
+      <w:r>
+        <w:rPr>
+          <w:rStyle w:val="VerbatimChar"/>
+        </w:rPr>
+        <w:t xml:space="preserve">netlify/content/data.mjs</w:t>
+      </w:r>
+      <w:r>
+        <w:t xml:space="preserve"> </w:t>
+      </w:r>
+      <w:r>
+        <w:t xml:space="preserve">en lugar de incrustar en</w:t>
+      </w:r>
+      <w:r>
+        <w:t xml:space="preserve"> </w:t>
+      </w:r>
+      <w:r>
+        <w:rPr>
+          <w:rStyle w:val="VerbatimChar"/>
+        </w:rPr>
+        <w:t xml:space="preserve">index.html</w:t>
+      </w:r>
+      <w:r>
+        <w:t xml:space="preserve">.</w:t>
+      </w:r>
+    </w:p>
+    <w:p>
+      <w:pPr>
+        <w:numPr>
+          <w:ilvl w:val="0"/>
+          <w:numId w:val="1007"/>
+        </w:numPr>
+        <w:pStyle w:val="Compact"/>
+      </w:pPr>
+      <w:r>
+        <w:t xml:space="preserve">Las funciones de Sunset que se mencionan como modelo</w:t>
+      </w:r>
+      <w:r>
+        <w:t xml:space="preserve"> </w:t>
+      </w:r>
+      <w:r>
+        <w:rPr>
+          <w:bCs/>
+          <w:b/>
+        </w:rPr>
+        <w:t xml:space="preserve">no están en este repositorio</w:t>
+      </w:r>
+      <w:r>
+        <w:t xml:space="preserve"> </w:t>
+      </w:r>
+      <w:r>
+        <w:t xml:space="preserve">(solo</w:t>
+      </w:r>
+      <w:r>
+        <w:t xml:space="preserve"> </w:t>
+      </w:r>
+      <w:r>
+        <w:rPr>
+          <w:rStyle w:val="VerbatimChar"/>
+        </w:rPr>
+        <w:t xml:space="preserve">netlify.toml</w:t>
+      </w:r>
+      <w:r>
+        <w:t xml:space="preserve">); hay que escribirlas o traerlas del repositorio de Sunset.</w:t>
+      </w:r>
+    </w:p>
+    <w:p>
+      <w:pPr>
+        <w:numPr>
+          <w:ilvl w:val="0"/>
+          <w:numId w:val="1007"/>
+        </w:numPr>
+        <w:pStyle w:val="Compact"/>
+      </w:pPr>
+      <w:r>
+        <w:rPr>
+          <w:bCs/>
+          <w:b/>
+        </w:rPr>
+        <w:t xml:space="preserve">Seguridad:</w:t>
+      </w:r>
+      <w:r>
+        <w:t xml:space="preserve"> </w:t>
+      </w:r>
+      <w:r>
+        <w:t xml:space="preserve">en la raíz,</w:t>
+      </w:r>
+      <w:r>
+        <w:t xml:space="preserve"> </w:t>
+      </w:r>
+      <w:r>
+        <w:rPr>
+          <w:rStyle w:val="VerbatimChar"/>
+        </w:rPr>
+        <w:t xml:space="preserve">notion.js</w:t>
+      </w:r>
+      <w:r>
+        <w:t xml:space="preserve"> </w:t>
+      </w:r>
+      <w:r>
+        <w:t xml:space="preserve">tiene un token de Notion escrito en el código. Revocarlo, crear uno nuevo y leerlo desde una variable de entorno. No reutilizar ese archivo.</w:t>
+      </w:r>
+    </w:p>
+    <w:bookmarkEnd w:id="38"/>
+    <w:bookmarkStart w:id="39" w:name="tareas-para-producción"/>
+    <w:p>
+      <w:pPr>
+        <w:pStyle w:val="Heading2"/>
+      </w:pPr>
+      <w:r>
+        <w:t xml:space="preserve">9. Tareas para producción</w:t>
       </w:r>
     </w:p>
     <w:p>
@@ -3618,54 +3913,22 @@
         <w:pStyle w:val="Compact"/>
       </w:pPr>
       <w:r>
-        <w:rPr>
-          <w:bCs/>
-          <w:b/>
-        </w:rPr>
-        <w:t xml:space="preserve">El contenido no va en</w:t>
-      </w:r>
-      <w:r>
-        <w:rPr>
-          <w:bCs/>
-          <w:b/>
-        </w:rPr>
-        <w:t xml:space="preserve"> </w:t>
-      </w:r>
-      <w:r>
-        <w:rPr>
-          <w:rStyle w:val="VerbatimChar"/>
-          <w:bCs/>
-          <w:b/>
-        </w:rPr>
-        <w:t xml:space="preserve">public/</w:t>
-      </w:r>
-      <w:r>
-        <w:rPr>
-          <w:bCs/>
-          <w:b/>
-        </w:rPr>
-        <w:t xml:space="preserve">:</w:t>
-      </w:r>
-      <w:r>
-        <w:t xml:space="preserve"> </w:t>
-      </w:r>
-      <w:r>
-        <w:t xml:space="preserve">solo por</w:t>
-      </w:r>
-      <w:r>
-        <w:t xml:space="preserve"> </w:t>
-      </w:r>
-      <w:r>
-        <w:rPr>
-          <w:rStyle w:val="VerbatimChar"/>
-        </w:rPr>
-        <w:t xml:space="preserve">/api/content</w:t>
-      </w:r>
-      <w:r>
-        <w:t xml:space="preserve"> </w:t>
-      </w:r>
-      <w:r>
-        <w:t xml:space="preserve">con clave; la app lo guarda en el dispositivo para usar sin conexión.</w:t>
+        <w:t xml:space="preserve">☐ Separar</w:t>
+      </w:r>
+      <w:r>
+        <w:t xml:space="preserve"> </w:t>
+      </w:r>
+      <w:r>
+        <w:rPr>
+          <w:rStyle w:val="VerbatimChar"/>
+        </w:rPr>
+        <w:t xml:space="preserve">index.html</w:t>
+      </w:r>
+      <w:r>
+        <w:t xml:space="preserve"> </w:t>
+      </w:r>
+      <w:r>
+        <w:t xml:space="preserve">en HTML, CSS y JS (§8), sin cambiar comportamiento.</w:t>
       </w:r>
     </w:p>
     <w:p>
@@ -3677,66 +3940,19 @@
         <w:pStyle w:val="Compact"/>
       </w:pPr>
       <w:r>
-        <w:rPr>
-          <w:bCs/>
-          <w:b/>
-        </w:rPr>
-        <w:t xml:space="preserve">Claves en variables de entorno</w:t>
-      </w:r>
-      <w:r>
-        <w:t xml:space="preserve"> </w:t>
-      </w:r>
-      <w:r>
-        <w:t xml:space="preserve">(por ejemplo</w:t>
-      </w:r>
-      <w:r>
-        <w:t xml:space="preserve"> </w:t>
-      </w:r>
-      <w:r>
-        <w:rPr>
-          <w:rStyle w:val="VerbatimChar"/>
-        </w:rPr>
-        <w:t xml:space="preserve">MENSAJERO_KEY</w:t>
-      </w:r>
-      <w:r>
-        <w:t xml:space="preserve">, cabecera</w:t>
-      </w:r>
-      <w:r>
-        <w:t xml:space="preserve"> </w:t>
-      </w:r>
-      <w:r>
-        <w:rPr>
-          <w:rStyle w:val="VerbatimChar"/>
-        </w:rPr>
-        <w:t xml:space="preserve">x-mensajero-key</w:t>
-      </w:r>
-      <w:r>
-        <w:t xml:space="preserve">). La</w:t>
-      </w:r>
-      <w:r>
-        <w:t xml:space="preserve"> </w:t>
-      </w:r>
-      <w:r>
-        <w:rPr>
-          <w:bCs/>
-          <w:b/>
-        </w:rPr>
-        <w:t xml:space="preserve">clave de coordinación</w:t>
-      </w:r>
-      <w:r>
-        <w:t xml:space="preserve"> </w:t>
-      </w:r>
-      <w:r>
-        <w:t xml:space="preserve">hoy está escrita en el código (</w:t>
-      </w:r>
-      <w:r>
-        <w:rPr>
-          <w:rStyle w:val="VerbatimChar"/>
-        </w:rPr>
-        <w:t xml:space="preserve">CLAVE_COORD</w:t>
-      </w:r>
-      <w:r>
-        <w:t xml:space="preserve">, provisoria) y debe pasar al servidor.</w:t>
+        <w:t xml:space="preserve">☐ Sacar el logo y la marca de data URI a</w:t>
+      </w:r>
+      <w:r>
+        <w:t xml:space="preserve"> </w:t>
+      </w:r>
+      <w:r>
+        <w:rPr>
+          <w:rStyle w:val="VerbatimChar"/>
+        </w:rPr>
+        <w:t xml:space="preserve">public/images/</w:t>
+      </w:r>
+      <w:r>
+        <w:t xml:space="preserve">.</w:t>
       </w:r>
     </w:p>
     <w:p>
@@ -3748,6 +3964,12 @@
         <w:pStyle w:val="Compact"/>
       </w:pPr>
       <w:r>
+        <w:t xml:space="preserve">☐</w:t>
+      </w:r>
+      <w:r>
+        <w:t xml:space="preserve"> </w:t>
+      </w:r>
+      <w:r>
         <w:rPr>
           <w:rStyle w:val="VerbatimChar"/>
         </w:rPr>
@@ -3757,7 +3979,7 @@
         <w:t xml:space="preserve"> </w:t>
       </w:r>
       <w:r>
-        <w:t xml:space="preserve">debe escribir</w:t>
+        <w:t xml:space="preserve">→</w:t>
       </w:r>
       <w:r>
         <w:t xml:space="preserve"> </w:t>
@@ -3767,21 +3989,6 @@
           <w:rStyle w:val="VerbatimChar"/>
         </w:rPr>
         <w:t xml:space="preserve">netlify/content/data.mjs</w:t>
-      </w:r>
-      <w:r>
-        <w:t xml:space="preserve"> </w:t>
-      </w:r>
-      <w:r>
-        <w:t xml:space="preserve">en lugar de incrustar en</w:t>
-      </w:r>
-      <w:r>
-        <w:t xml:space="preserve"> </w:t>
-      </w:r>
-      <w:r>
-        <w:rPr>
-          <w:rStyle w:val="VerbatimChar"/>
-        </w:rPr>
-        <w:t xml:space="preserve">index.html</w:t>
       </w:r>
       <w:r>
         <w:t xml:space="preserve">.</w:t>
@@ -3796,35 +4003,58 @@
         <w:pStyle w:val="Compact"/>
       </w:pPr>
       <w:r>
-        <w:t xml:space="preserve">Las funciones de Sunset que se mencionan como modelo</w:t>
-      </w:r>
-      <w:r>
-        <w:t xml:space="preserve"> </w:t>
-      </w:r>
-      <w:r>
-        <w:rPr>
-          <w:bCs/>
-          <w:b/>
-        </w:rPr>
-        <w:t xml:space="preserve">no están en este repositorio</w:t>
-      </w:r>
-      <w:r>
-        <w:t xml:space="preserve"> </w:t>
-      </w:r>
-      <w:r>
-        <w:t xml:space="preserve">(solo</w:t>
-      </w:r>
-      <w:r>
-        <w:t xml:space="preserve"> </w:t>
-      </w:r>
-      <w:r>
-        <w:rPr>
-          <w:rStyle w:val="VerbatimChar"/>
-        </w:rPr>
-        <w:t xml:space="preserve">netlify.toml</w:t>
-      </w:r>
-      <w:r>
-        <w:t xml:space="preserve">); hay que escribirlas o traerlas del repositorio de Sunset.</w:t>
+        <w:t xml:space="preserve">☐ Funciones</w:t>
+      </w:r>
+      <w:r>
+        <w:t xml:space="preserve"> </w:t>
+      </w:r>
+      <w:r>
+        <w:rPr>
+          <w:rStyle w:val="VerbatimChar"/>
+        </w:rPr>
+        <w:t xml:space="preserve">content</w:t>
+      </w:r>
+      <w:r>
+        <w:t xml:space="preserve">,</w:t>
+      </w:r>
+      <w:r>
+        <w:t xml:space="preserve"> </w:t>
+      </w:r>
+      <w:r>
+        <w:rPr>
+          <w:rStyle w:val="VerbatimChar"/>
+        </w:rPr>
+        <w:t xml:space="preserve">sync</w:t>
+      </w:r>
+      <w:r>
+        <w:t xml:space="preserve">,</w:t>
+      </w:r>
+      <w:r>
+        <w:t xml:space="preserve"> </w:t>
+      </w:r>
+      <w:r>
+        <w:rPr>
+          <w:rStyle w:val="VerbatimChar"/>
+        </w:rPr>
+        <w:t xml:space="preserve">auth</w:t>
+      </w:r>
+      <w:r>
+        <w:t xml:space="preserve">; reemplazar</w:t>
+      </w:r>
+      <w:r>
+        <w:t xml:space="preserve"> </w:t>
+      </w:r>
+      <w:r>
+        <w:rPr>
+          <w:rStyle w:val="VerbatimChar"/>
+        </w:rPr>
+        <w:t xml:space="preserve">localStorage</w:t>
+      </w:r>
+      <w:r>
+        <w:t xml:space="preserve"> </w:t>
+      </w:r>
+      <w:r>
+        <w:t xml:space="preserve">por sincronización (con caché local para usar sin conexión).</w:t>
       </w:r>
     </w:p>
     <w:p>
@@ -3836,42 +4066,173 @@
         <w:pStyle w:val="Compact"/>
       </w:pPr>
       <w:r>
-        <w:rPr>
+        <w:t xml:space="preserve">☐ Clave de coordinación en el servidor; registro de aperturas en el servidor.</w:t>
+      </w:r>
+    </w:p>
+    <w:p>
+      <w:pPr>
+        <w:numPr>
+          <w:ilvl w:val="0"/>
+          <w:numId w:val="1008"/>
+        </w:numPr>
+        <w:pStyle w:val="Compact"/>
+      </w:pPr>
+      <w:r>
+        <w:t xml:space="preserve">☐ Decidir usuarios (§11) y, si hay una clave por locutor, guardar el autor de cada marca.</w:t>
+      </w:r>
+    </w:p>
+    <w:p>
+      <w:pPr>
+        <w:numPr>
+          <w:ilvl w:val="0"/>
+          <w:numId w:val="1008"/>
+        </w:numPr>
+        <w:pStyle w:val="Compact"/>
+      </w:pPr>
+      <w:r>
+        <w:t xml:space="preserve">☐ Panel de coordinación: informes de todos los locutores por mes (hoy cada informe es del dispositivo).</w:t>
+      </w:r>
+    </w:p>
+    <w:p>
+      <w:pPr>
+        <w:numPr>
+          <w:ilvl w:val="0"/>
+          <w:numId w:val="1008"/>
+        </w:numPr>
+        <w:pStyle w:val="Compact"/>
+      </w:pPr>
+      <w:r>
+        <w:t xml:space="preserve">☐ Copias diarias, exportar e importar JSON.</w:t>
+      </w:r>
+    </w:p>
+    <w:p>
+      <w:pPr>
+        <w:numPr>
+          <w:ilvl w:val="0"/>
+          <w:numId w:val="1008"/>
+        </w:numPr>
+        <w:pStyle w:val="Compact"/>
+      </w:pPr>
+      <w:r>
+        <w:t xml:space="preserve">☐ PWA: subir</w:t>
+      </w:r>
+      <w:r>
+        <w:t xml:space="preserve"> </w:t>
+      </w:r>
+      <w:r>
+        <w:rPr>
+          <w:rStyle w:val="VerbatimChar"/>
+        </w:rPr>
+        <w:t xml:space="preserve">CACHE</w:t>
+      </w:r>
+      <w:r>
+        <w:t xml:space="preserve"> </w:t>
+      </w:r>
+      <w:r>
+        <w:t xml:space="preserve">en</w:t>
+      </w:r>
+      <w:r>
+        <w:t xml:space="preserve"> </w:t>
+      </w:r>
+      <w:r>
+        <w:rPr>
+          <w:rStyle w:val="VerbatimChar"/>
+        </w:rPr>
+        <w:t xml:space="preserve">sw.js</w:t>
+      </w:r>
+      <w:r>
+        <w:t xml:space="preserve"> </w:t>
+      </w:r>
+      <w:r>
+        <w:t xml:space="preserve">en cada entrega.</w:t>
+      </w:r>
+    </w:p>
+    <w:p>
+      <w:pPr>
+        <w:numPr>
+          <w:ilvl w:val="0"/>
+          <w:numId w:val="1008"/>
+        </w:numPr>
+        <w:pStyle w:val="Compact"/>
+      </w:pPr>
+      <w:r>
+        <w:t xml:space="preserve">☐ Pruebas: mantener</w:t>
+      </w:r>
+      <w:r>
+        <w:t xml:space="preserve"> </w:t>
+      </w:r>
+      <w:r>
+        <w:rPr>
+          <w:rStyle w:val="VerbatimChar"/>
+        </w:rPr>
+        <w:t xml:space="preserve">tests/humo.cjs</w:t>
+      </w:r>
+      <w:r>
+        <w:t xml:space="preserve"> </w:t>
+      </w:r>
+      <w:r>
+        <w:t xml:space="preserve">en verde; sumar pruebas de fusión de entries, conteo mensual en fin de mes y semana cerrada; accesibilidad (axe sin violaciones).</w:t>
+      </w:r>
+    </w:p>
+    <w:p>
+      <w:pPr>
+        <w:numPr>
+          <w:ilvl w:val="0"/>
+          <w:numId w:val="1008"/>
+        </w:numPr>
+        <w:pStyle w:val="Compact"/>
+      </w:pPr>
+      <w:r>
+        <w:t xml:space="preserve">☐ Sitio en Netlify y variables de entorno.</w:t>
+      </w:r>
+    </w:p>
+    <w:bookmarkEnd w:id="39"/>
+    <w:bookmarkStart w:id="40" w:name="X1c70bed5ef1645ee90798d85d0bb9574259c770"/>
+    <w:p>
+      <w:pPr>
+        <w:pStyle w:val="Heading2"/>
+      </w:pPr>
+      <w:r>
+        <w:t xml:space="preserve">10. Lista de aceptación (lo que tiene que salir del horno)</w:t>
+      </w:r>
+    </w:p>
+    <w:p>
+      <w:pPr>
+        <w:pStyle w:val="FirstParagraph"/>
+      </w:pPr>
+      <w:r>
+        <w:t xml:space="preserve">La versión de producción se acepta cuando</w:t>
+      </w:r>
+      <w:r>
+        <w:t xml:space="preserve"> </w:t>
+      </w:r>
+      <w:r>
+        <w:rPr>
+          <w:rStyle w:val="VerbatimChar"/>
           <w:bCs/>
           <w:b/>
         </w:rPr>
-        <w:t xml:space="preserve">Seguridad:</w:t>
-      </w:r>
-      <w:r>
-        <w:t xml:space="preserve"> </w:t>
-      </w:r>
-      <w:r>
-        <w:t xml:space="preserve">en la raíz,</w:t>
-      </w:r>
-      <w:r>
-        <w:t xml:space="preserve"> </w:t>
-      </w:r>
-      <w:r>
-        <w:rPr>
-          <w:rStyle w:val="VerbatimChar"/>
-        </w:rPr>
-        <w:t xml:space="preserve">notion.js</w:t>
-      </w:r>
-      <w:r>
-        <w:t xml:space="preserve"> </w:t>
-      </w:r>
-      <w:r>
-        <w:t xml:space="preserve">tiene un token de Notion escrito en el código. Revocarlo, crear uno nuevo y leerlo desde una variable de entorno. No reutilizar ese archivo.</w:t>
-      </w:r>
-    </w:p>
-    <w:bookmarkEnd w:id="37"/>
-    <w:bookmarkStart w:id="38" w:name="tareas-para-producción"/>
-    <w:p>
-      <w:pPr>
-        <w:pStyle w:val="Heading2"/>
-      </w:pPr>
-      <w:r>
-        <w:t xml:space="preserve">9. Tareas para producción</w:t>
+        <w:t xml:space="preserve">node tests/humo.cjs</w:t>
+      </w:r>
+      <w:r>
+        <w:rPr>
+          <w:bCs/>
+          <w:b/>
+        </w:rPr>
+        <w:t xml:space="preserve"> </w:t>
+      </w:r>
+      <w:r>
+        <w:rPr>
+          <w:bCs/>
+          <w:b/>
+        </w:rPr>
+        <w:t xml:space="preserve">pasa los 41 controles</w:t>
+      </w:r>
+      <w:r>
+        <w:t xml:space="preserve"> </w:t>
+      </w:r>
+      <w:r>
+        <w:t xml:space="preserve">apuntando a la nueva app, y además:</w:t>
       </w:r>
     </w:p>
     <w:p>
@@ -3883,22 +4244,7 @@
         <w:pStyle w:val="Compact"/>
       </w:pPr>
       <w:r>
-        <w:t xml:space="preserve">☐ Separar</w:t>
-      </w:r>
-      <w:r>
-        <w:t xml:space="preserve"> </w:t>
-      </w:r>
-      <w:r>
-        <w:rPr>
-          <w:rStyle w:val="VerbatimChar"/>
-        </w:rPr>
-        <w:t xml:space="preserve">index.html</w:t>
-      </w:r>
-      <w:r>
-        <w:t xml:space="preserve"> </w:t>
-      </w:r>
-      <w:r>
-        <w:t xml:space="preserve">en HTML, CSS y JS (§8), sin cambiar comportamiento.</w:t>
+        <w:t xml:space="preserve">Mismo aspecto que el prototipo en celular (oscuro) y computadora (clara), en las 7 escenas.</w:t>
       </w:r>
     </w:p>
     <w:p>
@@ -3910,19 +4256,7 @@
         <w:pStyle w:val="Compact"/>
       </w:pPr>
       <w:r>
-        <w:t xml:space="preserve">☐ Sacar el logo y la marca de data URI a</w:t>
-      </w:r>
-      <w:r>
-        <w:t xml:space="preserve"> </w:t>
-      </w:r>
-      <w:r>
-        <w:rPr>
-          <w:rStyle w:val="VerbatimChar"/>
-        </w:rPr>
-        <w:t xml:space="preserve">public/images/</w:t>
-      </w:r>
-      <w:r>
-        <w:t xml:space="preserve">.</w:t>
+        <w:t xml:space="preserve">Un locutor marca en el celular y lo ve en la computadora (sincronización), y viceversa, sin perder marcas cuando las dos editan (gana la más reciente por clave).</w:t>
       </w:r>
     </w:p>
     <w:p>
@@ -3934,34 +4268,7 @@
         <w:pStyle w:val="Compact"/>
       </w:pPr>
       <w:r>
-        <w:t xml:space="preserve">☐</w:t>
-      </w:r>
-      <w:r>
-        <w:t xml:space="preserve"> </w:t>
-      </w:r>
-      <w:r>
-        <w:rPr>
-          <w:rStyle w:val="VerbatimChar"/>
-        </w:rPr>
-        <w:t xml:space="preserve">build_data.py</w:t>
-      </w:r>
-      <w:r>
-        <w:t xml:space="preserve"> </w:t>
-      </w:r>
-      <w:r>
-        <w:t xml:space="preserve">→</w:t>
-      </w:r>
-      <w:r>
-        <w:t xml:space="preserve"> </w:t>
-      </w:r>
-      <w:r>
-        <w:rPr>
-          <w:rStyle w:val="VerbatimChar"/>
-        </w:rPr>
-        <w:t xml:space="preserve">netlify/content/data.mjs</w:t>
-      </w:r>
-      <w:r>
-        <w:t xml:space="preserve">.</w:t>
+        <w:t xml:space="preserve">Sin conexión: abre la última semana descargada y guarda marcas que se suben al volver la conexión.</w:t>
       </w:r>
     </w:p>
     <w:p>
@@ -3973,58 +4280,7 @@
         <w:pStyle w:val="Compact"/>
       </w:pPr>
       <w:r>
-        <w:t xml:space="preserve">☐ Funciones</w:t>
-      </w:r>
-      <w:r>
-        <w:t xml:space="preserve"> </w:t>
-      </w:r>
-      <w:r>
-        <w:rPr>
-          <w:rStyle w:val="VerbatimChar"/>
-        </w:rPr>
-        <w:t xml:space="preserve">content</w:t>
-      </w:r>
-      <w:r>
-        <w:t xml:space="preserve">,</w:t>
-      </w:r>
-      <w:r>
-        <w:t xml:space="preserve"> </w:t>
-      </w:r>
-      <w:r>
-        <w:rPr>
-          <w:rStyle w:val="VerbatimChar"/>
-        </w:rPr>
-        <w:t xml:space="preserve">sync</w:t>
-      </w:r>
-      <w:r>
-        <w:t xml:space="preserve">,</w:t>
-      </w:r>
-      <w:r>
-        <w:t xml:space="preserve"> </w:t>
-      </w:r>
-      <w:r>
-        <w:rPr>
-          <w:rStyle w:val="VerbatimChar"/>
-        </w:rPr>
-        <w:t xml:space="preserve">auth</w:t>
-      </w:r>
-      <w:r>
-        <w:t xml:space="preserve">; reemplazar</w:t>
-      </w:r>
-      <w:r>
-        <w:t xml:space="preserve"> </w:t>
-      </w:r>
-      <w:r>
-        <w:rPr>
-          <w:rStyle w:val="VerbatimChar"/>
-        </w:rPr>
-        <w:t xml:space="preserve">localStorage</w:t>
-      </w:r>
-      <w:r>
-        <w:t xml:space="preserve"> </w:t>
-      </w:r>
-      <w:r>
-        <w:t xml:space="preserve">por sincronización (con caché local para usar sin conexión).</w:t>
+        <w:t xml:space="preserve">Una semana cerrada no se puede cambiar sin la clave de coordinación, que ya no está en el código del navegador.</w:t>
       </w:r>
     </w:p>
     <w:p>
@@ -4036,173 +4292,17 @@
         <w:pStyle w:val="Compact"/>
       </w:pPr>
       <w:r>
-        <w:t xml:space="preserve">☐ Clave de coordinación en el servidor; registro de aperturas en el servidor.</w:t>
-      </w:r>
-    </w:p>
-    <w:p>
-      <w:pPr>
-        <w:numPr>
-          <w:ilvl w:val="0"/>
-          <w:numId w:val="1009"/>
-        </w:numPr>
-        <w:pStyle w:val="Compact"/>
-      </w:pPr>
-      <w:r>
-        <w:t xml:space="preserve">☐ Decidir usuarios (§11) y, si hay una clave por locutor, guardar el autor de cada marca.</w:t>
-      </w:r>
-    </w:p>
-    <w:p>
-      <w:pPr>
-        <w:numPr>
-          <w:ilvl w:val="0"/>
-          <w:numId w:val="1009"/>
-        </w:numPr>
-        <w:pStyle w:val="Compact"/>
-      </w:pPr>
-      <w:r>
-        <w:t xml:space="preserve">☐ Panel de coordinación: informes de todos los locutores por mes (hoy cada informe es del dispositivo).</w:t>
-      </w:r>
-    </w:p>
-    <w:p>
-      <w:pPr>
-        <w:numPr>
-          <w:ilvl w:val="0"/>
-          <w:numId w:val="1009"/>
-        </w:numPr>
-        <w:pStyle w:val="Compact"/>
-      </w:pPr>
-      <w:r>
-        <w:t xml:space="preserve">☐ Copias diarias, exportar e importar JSON.</w:t>
-      </w:r>
-    </w:p>
-    <w:p>
-      <w:pPr>
-        <w:numPr>
-          <w:ilvl w:val="0"/>
-          <w:numId w:val="1009"/>
-        </w:numPr>
-        <w:pStyle w:val="Compact"/>
-      </w:pPr>
-      <w:r>
-        <w:t xml:space="preserve">☐ PWA: subir</w:t>
-      </w:r>
-      <w:r>
-        <w:t xml:space="preserve"> </w:t>
-      </w:r>
-      <w:r>
-        <w:rPr>
-          <w:rStyle w:val="VerbatimChar"/>
-        </w:rPr>
-        <w:t xml:space="preserve">CACHE</w:t>
-      </w:r>
-      <w:r>
-        <w:t xml:space="preserve"> </w:t>
-      </w:r>
-      <w:r>
-        <w:t xml:space="preserve">en</w:t>
-      </w:r>
-      <w:r>
-        <w:t xml:space="preserve"> </w:t>
-      </w:r>
-      <w:r>
-        <w:rPr>
-          <w:rStyle w:val="VerbatimChar"/>
-        </w:rPr>
-        <w:t xml:space="preserve">sw.js</w:t>
-      </w:r>
-      <w:r>
-        <w:t xml:space="preserve"> </w:t>
-      </w:r>
-      <w:r>
-        <w:t xml:space="preserve">en cada entrega.</w:t>
-      </w:r>
-    </w:p>
-    <w:p>
-      <w:pPr>
-        <w:numPr>
-          <w:ilvl w:val="0"/>
-          <w:numId w:val="1009"/>
-        </w:numPr>
-        <w:pStyle w:val="Compact"/>
-      </w:pPr>
-      <w:r>
-        <w:t xml:space="preserve">☐ Pruebas: mantener</w:t>
-      </w:r>
-      <w:r>
-        <w:t xml:space="preserve"> </w:t>
-      </w:r>
-      <w:r>
-        <w:rPr>
-          <w:rStyle w:val="VerbatimChar"/>
-        </w:rPr>
-        <w:t xml:space="preserve">tests/humo.cjs</w:t>
-      </w:r>
-      <w:r>
-        <w:t xml:space="preserve"> </w:t>
-      </w:r>
-      <w:r>
-        <w:t xml:space="preserve">en verde; sumar pruebas de fusión de entries, conteo mensual en fin de mes y semana cerrada; accesibilidad (axe sin violaciones).</w:t>
-      </w:r>
-    </w:p>
-    <w:p>
-      <w:pPr>
-        <w:numPr>
-          <w:ilvl w:val="0"/>
-          <w:numId w:val="1009"/>
-        </w:numPr>
-        <w:pStyle w:val="Compact"/>
-      </w:pPr>
-      <w:r>
-        <w:t xml:space="preserve">☐ Sitio en Netlify y variables de entorno.</w:t>
-      </w:r>
-    </w:p>
-    <w:bookmarkEnd w:id="38"/>
-    <w:bookmarkStart w:id="39" w:name="X1c70bed5ef1645ee90798d85d0bb9574259c770"/>
+        <w:t xml:space="preserve">El contenido no se puede descargar sin la clave.</w:t>
+      </w:r>
+    </w:p>
+    <w:bookmarkEnd w:id="40"/>
+    <w:bookmarkStart w:id="41" w:name="X41c5b1a1bf74ad38e1583cba0e2159d156cb3c3"/>
     <w:p>
       <w:pPr>
         <w:pStyle w:val="Heading2"/>
       </w:pPr>
       <w:r>
-        <w:t xml:space="preserve">10. Lista de aceptación (lo que tiene que salir del horno)</w:t>
-      </w:r>
-    </w:p>
-    <w:p>
-      <w:pPr>
-        <w:pStyle w:val="FirstParagraph"/>
-      </w:pPr>
-      <w:r>
-        <w:t xml:space="preserve">La versión de producción se acepta cuando</w:t>
-      </w:r>
-      <w:r>
-        <w:t xml:space="preserve"> </w:t>
-      </w:r>
-      <w:r>
-        <w:rPr>
-          <w:rStyle w:val="VerbatimChar"/>
-          <w:bCs/>
-          <w:b/>
-        </w:rPr>
-        <w:t xml:space="preserve">node tests/humo.cjs</w:t>
-      </w:r>
-      <w:r>
-        <w:rPr>
-          <w:bCs/>
-          <w:b/>
-        </w:rPr>
-        <w:t xml:space="preserve"> </w:t>
-      </w:r>
-      <w:r>
-        <w:rPr>
-          <w:bCs/>
-          <w:b/>
-        </w:rPr>
-        <w:t xml:space="preserve">pasa los 41 controles</w:t>
-      </w:r>
-      <w:r>
-        <w:t xml:space="preserve"> </w:t>
-      </w:r>
-      <w:r>
-        <w:t xml:space="preserve">apuntando a la nueva app, y además:</w:t>
+        <w:t xml:space="preserve">11. Decisiones pendientes (no son del programador, pero lo afectan)</w:t>
       </w:r>
     </w:p>
     <w:p>
@@ -4214,7 +4314,44 @@
         <w:pStyle w:val="Compact"/>
       </w:pPr>
       <w:r>
-        <w:t xml:space="preserve">Mismo aspecto que el prototipo en celular (oscuro) y computadora (clara), en las 7 escenas.</w:t>
+        <w:rPr>
+          <w:bCs/>
+          <w:b/>
+        </w:rPr>
+        <w:t xml:space="preserve">Versículos:</w:t>
+      </w:r>
+      <w:r>
+        <w:t xml:space="preserve"> </w:t>
+      </w:r>
+      <w:r>
+        <w:t xml:space="preserve">12 cambios sugeridos esperan la decisión de Richarh (documento «Versículos a corregir 2027»,</w:t>
+      </w:r>
+      <w:r>
+        <w:t xml:space="preserve"> </w:t>
+      </w:r>
+      <w:r>
+        <w:rPr>
+          <w:rStyle w:val="VerbatimChar"/>
+        </w:rPr>
+        <w:t xml:space="preserve">content/versiculos_sugeridos.md</w:t>
+      </w:r>
+      <w:r>
+        <w:t xml:space="preserve">). Los aprobados se aplican con</w:t>
+      </w:r>
+      <w:r>
+        <w:t xml:space="preserve"> </w:t>
+      </w:r>
+      <w:r>
+        <w:rPr>
+          <w:rStyle w:val="VerbatimChar"/>
+        </w:rPr>
+        <w:t xml:space="preserve">tools/versiculos_aplicados_2027.py</w:t>
+      </w:r>
+      <w:r>
+        <w:t xml:space="preserve"> </w:t>
+      </w:r>
+      <w:r>
+        <w:t xml:space="preserve">y se reescriben esos guiones.</w:t>
       </w:r>
     </w:p>
     <w:p>
@@ -4226,7 +4363,26 @@
         <w:pStyle w:val="Compact"/>
       </w:pPr>
       <w:r>
-        <w:t xml:space="preserve">Un locutor marca en el celular y lo ve en la computadora (sincronización), y viceversa, sin perder marcas cuando las dos editan (gana la más reciente por clave).</w:t>
+        <w:rPr>
+          <w:strike/>
+        </w:rPr>
+        <w:t xml:space="preserve">Viernes Santo, Pascua y Navidad</w:t>
+      </w:r>
+      <w:r>
+        <w:t xml:space="preserve"> </w:t>
+      </w:r>
+      <w:r>
+        <w:rPr>
+          <w:bCs/>
+          <w:b/>
+        </w:rPr>
+        <w:t xml:space="preserve">Resuelto el 20/10/2026:</w:t>
+      </w:r>
+      <w:r>
+        <w:t xml:space="preserve"> </w:t>
+      </w:r>
+      <w:r>
+        <w:t xml:space="preserve">se sigue la serie; cada locutor adapta la fecha en su preparación (sin cambios en la app ni en el contenido).</w:t>
       </w:r>
     </w:p>
     <w:p>
@@ -4238,7 +4394,17 @@
         <w:pStyle w:val="Compact"/>
       </w:pPr>
       <w:r>
-        <w:t xml:space="preserve">Sin conexión: abre la última semana descargada y guarda marcas que se suben al volver la conexión.</w:t>
+        <w:rPr>
+          <w:bCs/>
+          <w:b/>
+        </w:rPr>
+        <w:t xml:space="preserve">Usuarios:</w:t>
+      </w:r>
+      <w:r>
+        <w:t xml:space="preserve"> </w:t>
+      </w:r>
+      <w:r>
+        <w:t xml:space="preserve">una clave para todo el equipo o una por locutor (necesaria si el registro debe decir quién hizo cada marca).</w:t>
       </w:r>
     </w:p>
     <w:p>
@@ -4250,7 +4416,17 @@
         <w:pStyle w:val="Compact"/>
       </w:pPr>
       <w:r>
-        <w:t xml:space="preserve">Una semana cerrada no se puede cambiar sin la clave de coordinación, que ya no está en el código del navegador.</w:t>
+        <w:rPr>
+          <w:bCs/>
+          <w:b/>
+        </w:rPr>
+        <w:t xml:space="preserve">Hoja «Mensajero»:</w:t>
+      </w:r>
+      <w:r>
+        <w:t xml:space="preserve"> </w:t>
+      </w:r>
+      <w:r>
+        <w:t xml:space="preserve">faltan 17 datos (historia, fundación, misión, visión, sitio web, redes, contactos por área, organigrama).</w:t>
       </w:r>
     </w:p>
     <w:p>
@@ -4262,198 +4438,52 @@
         <w:pStyle w:val="Compact"/>
       </w:pPr>
       <w:r>
-        <w:t xml:space="preserve">El contenido no se puede descargar sin la clave.</w:t>
-      </w:r>
-    </w:p>
-    <w:bookmarkEnd w:id="39"/>
-    <w:bookmarkStart w:id="40" w:name="X41c5b1a1bf74ad38e1583cba0e2159d156cb3c3"/>
-    <w:p>
-      <w:pPr>
-        <w:pStyle w:val="Heading2"/>
-      </w:pPr>
-      <w:r>
-        <w:t xml:space="preserve">11. Decisiones pendientes (no son del programador, pero lo afectan)</w:t>
+        <w:rPr>
+          <w:bCs/>
+          <w:b/>
+        </w:rPr>
+        <w:t xml:space="preserve">Números útiles:</w:t>
+      </w:r>
+      <w:r>
+        <w:t xml:space="preserve"> </w:t>
+      </w:r>
+      <w:r>
+        <w:t xml:space="preserve">reconfirmar los seis antes de la salida y cada tanto.</w:t>
       </w:r>
     </w:p>
     <w:p>
       <w:pPr>
         <w:numPr>
           <w:ilvl w:val="0"/>
-          <w:numId w:val="1011"/>
+          <w:numId w:val="1010"/>
         </w:numPr>
         <w:pStyle w:val="Compact"/>
       </w:pPr>
       <w:r>
         <w:rPr>
+          <w:strike/>
+        </w:rPr>
+        <w:t xml:space="preserve">Tres frases célebres con fuente parcial</w:t>
+      </w:r>
+      <w:r>
+        <w:t xml:space="preserve"> </w:t>
+      </w:r>
+      <w:r>
+        <w:rPr>
           <w:bCs/>
           <w:b/>
         </w:rPr>
-        <w:t xml:space="preserve">Versículos:</w:t>
-      </w:r>
-      <w:r>
-        <w:t xml:space="preserve"> </w:t>
-      </w:r>
-      <w:r>
-        <w:t xml:space="preserve">12 cambios sugeridos esperan la decisión de Richarh (documento «Versículos a corregir 2027»,</w:t>
-      </w:r>
-      <w:r>
-        <w:t xml:space="preserve"> </w:t>
-      </w:r>
-      <w:r>
-        <w:rPr>
-          <w:rStyle w:val="VerbatimChar"/>
-        </w:rPr>
-        <w:t xml:space="preserve">content/versiculos_sugeridos.md</w:t>
-      </w:r>
-      <w:r>
-        <w:t xml:space="preserve">). Los aprobados se aplican con</w:t>
-      </w:r>
-      <w:r>
-        <w:t xml:space="preserve"> </w:t>
-      </w:r>
-      <w:r>
-        <w:rPr>
-          <w:rStyle w:val="VerbatimChar"/>
-        </w:rPr>
-        <w:t xml:space="preserve">tools/versiculos_aplicados_2027.py</w:t>
-      </w:r>
-      <w:r>
-        <w:t xml:space="preserve"> </w:t>
-      </w:r>
-      <w:r>
-        <w:t xml:space="preserve">y se reescriben esos guiones.</w:t>
-      </w:r>
-    </w:p>
-    <w:p>
-      <w:pPr>
-        <w:numPr>
-          <w:ilvl w:val="0"/>
-          <w:numId w:val="1011"/>
-        </w:numPr>
-        <w:pStyle w:val="Compact"/>
-      </w:pPr>
-      <w:r>
-        <w:rPr>
-          <w:strike/>
-        </w:rPr>
-        <w:t xml:space="preserve">Viernes Santo, Pascua y Navidad</w:t>
-      </w:r>
-      <w:r>
-        <w:t xml:space="preserve"> </w:t>
-      </w:r>
-      <w:r>
-        <w:rPr>
-          <w:bCs/>
-          <w:b/>
-        </w:rPr>
         <w:t xml:space="preserve">Resuelto el 20/10/2026:</w:t>
       </w:r>
       <w:r>
         <w:t xml:space="preserve"> </w:t>
       </w:r>
       <w:r>
-        <w:t xml:space="preserve">se sigue la serie; cada locutor adapta la fecha en su preparación (sin cambios en la app ni en el contenido).</w:t>
-      </w:r>
-    </w:p>
-    <w:p>
-      <w:pPr>
-        <w:numPr>
-          <w:ilvl w:val="0"/>
-          <w:numId w:val="1011"/>
-        </w:numPr>
-        <w:pStyle w:val="Compact"/>
-      </w:pPr>
-      <w:r>
-        <w:rPr>
-          <w:bCs/>
-          <w:b/>
-        </w:rPr>
-        <w:t xml:space="preserve">Usuarios:</w:t>
-      </w:r>
-      <w:r>
-        <w:t xml:space="preserve"> </w:t>
-      </w:r>
-      <w:r>
-        <w:t xml:space="preserve">una clave para todo el equipo o una por locutor (necesaria si el registro debe decir quién hizo cada marca).</w:t>
-      </w:r>
-    </w:p>
-    <w:p>
-      <w:pPr>
-        <w:numPr>
-          <w:ilvl w:val="0"/>
-          <w:numId w:val="1011"/>
-        </w:numPr>
-        <w:pStyle w:val="Compact"/>
-      </w:pPr>
-      <w:r>
-        <w:rPr>
-          <w:bCs/>
-          <w:b/>
-        </w:rPr>
-        <w:t xml:space="preserve">Hoja «Mensajero»:</w:t>
-      </w:r>
-      <w:r>
-        <w:t xml:space="preserve"> </w:t>
-      </w:r>
-      <w:r>
-        <w:t xml:space="preserve">faltan 17 datos (historia, fundación, misión, visión, sitio web, redes, contactos por área, organigrama).</w:t>
-      </w:r>
-    </w:p>
-    <w:p>
-      <w:pPr>
-        <w:numPr>
-          <w:ilvl w:val="0"/>
-          <w:numId w:val="1011"/>
-        </w:numPr>
-        <w:pStyle w:val="Compact"/>
-      </w:pPr>
-      <w:r>
-        <w:rPr>
-          <w:bCs/>
-          <w:b/>
-        </w:rPr>
-        <w:t xml:space="preserve">Números útiles:</w:t>
-      </w:r>
-      <w:r>
-        <w:t xml:space="preserve"> </w:t>
-      </w:r>
-      <w:r>
-        <w:t xml:space="preserve">reconfirmar los seis antes de la salida y cada tanto.</w:t>
-      </w:r>
-    </w:p>
-    <w:p>
-      <w:pPr>
-        <w:numPr>
-          <w:ilvl w:val="0"/>
-          <w:numId w:val="1011"/>
-        </w:numPr>
-        <w:pStyle w:val="Compact"/>
-      </w:pPr>
-      <w:r>
-        <w:rPr>
-          <w:strike/>
-        </w:rPr>
-        <w:t xml:space="preserve">Tres frases célebres con fuente parcial</w:t>
-      </w:r>
-      <w:r>
-        <w:t xml:space="preserve"> </w:t>
-      </w:r>
-      <w:r>
-        <w:rPr>
-          <w:bCs/>
-          <w:b/>
-        </w:rPr>
-        <w:t xml:space="preserve">Resuelto el 20/10/2026:</w:t>
-      </w:r>
-      <w:r>
-        <w:t xml:space="preserve"> </w:t>
-      </w:r>
-      <w:r>
         <w:t xml:space="preserve">Cervantes confirmada (II parte, cap. XVII); Spurgeon pasa a «Proverbio recogido por Charles H. Spurgeon»; Temple se mantiene con su definición completa (autor confirmado; el libro exacto, no).</w:t>
       </w:r>
     </w:p>
-    <w:bookmarkEnd w:id="40"/>
-    <w:bookmarkStart w:id="41" w:name="archivos"/>
+    <w:bookmarkEnd w:id="41"/>
+    <w:bookmarkStart w:id="42" w:name="archivos"/>
     <w:p>
       <w:pPr>
         <w:pStyle w:val="Heading2"/>
@@ -4894,8 +4924,8 @@
         </w:tc>
       </w:tr>
     </w:tbl>
-    <w:bookmarkEnd w:id="41"/>
-    <w:bookmarkStart w:id="42" w:name="depuración-hecha-antes-de-la-entrega"/>
+    <w:bookmarkEnd w:id="42"/>
+    <w:bookmarkStart w:id="43" w:name="depuración-hecha-antes-de-la-entrega"/>
     <w:p>
       <w:pPr>
         <w:pStyle w:val="Heading2"/>
@@ -4908,7 +4938,7 @@
       <w:pPr>
         <w:numPr>
           <w:ilvl w:val="0"/>
-          <w:numId w:val="1012"/>
+          <w:numId w:val="1011"/>
         </w:numPr>
         <w:pStyle w:val="Compact"/>
       </w:pPr>
@@ -4920,7 +4950,7 @@
       <w:pPr>
         <w:numPr>
           <w:ilvl w:val="0"/>
-          <w:numId w:val="1012"/>
+          <w:numId w:val="1011"/>
         </w:numPr>
         <w:pStyle w:val="Compact"/>
       </w:pPr>
@@ -4932,7 +4962,7 @@
       <w:pPr>
         <w:numPr>
           <w:ilvl w:val="0"/>
-          <w:numId w:val="1012"/>
+          <w:numId w:val="1011"/>
         </w:numPr>
         <w:pStyle w:val="Compact"/>
       </w:pPr>
@@ -4944,7 +4974,7 @@
       <w:pPr>
         <w:numPr>
           <w:ilvl w:val="0"/>
-          <w:numId w:val="1012"/>
+          <w:numId w:val="1011"/>
         </w:numPr>
         <w:pStyle w:val="Compact"/>
       </w:pPr>
@@ -4952,8 +4982,8 @@
         <w:t xml:space="preserve">Tamaño del prototipo: 928 KB, de los cuales 730 KB son el contenido del año, 92 KB la lógica, 38 KB el diseño y 60 KB los dos logos incrustados. En producción el contenido y los logos salen del HTML.</w:t>
       </w:r>
     </w:p>
-    <w:bookmarkEnd w:id="42"/>
     <w:bookmarkEnd w:id="43"/>
+    <w:bookmarkEnd w:id="44"/>
     <w:sectPr/>
   </w:body>
 </w:document>
@@ -5279,9 +5309,6 @@
     <w:abstractNumId w:val="991"/>
   </w:num>
   <w:num w:numId="1010">
-    <w:abstractNumId w:val="991"/>
-  </w:num>
-  <w:num w:numId="1011">
     <w:abstractNumId w:val="99411"/>
     <w:lvlOverride w:ilvl="0">
       <w:startOverride w:val="1"/>
@@ -5311,7 +5338,7 @@
       <w:startOverride w:val="1"/>
     </w:lvlOverride>
   </w:num>
-  <w:num w:numId="1012">
+  <w:num w:numId="1011">
     <w:abstractNumId w:val="991"/>
   </w:num>
 </w:numbering>

</xml_diff>

<commit_message>
Mensajero: frase célebre visible en la tarjeta del día («Frase para el aire») y en el guion copiado
Co-Authored-By: Claude Opus 5.5 <noreply@anthropic.com>
Claude-Session: https://claude.ai/code/session_012sZjyYY9ZpXrog9pNGjXta
</commit_message>
<xml_diff>
--- a/mensajero/ENTREGA_PROGRAMADOR.docx
+++ b/mensajero/ENTREGA_PROGRAMADOR.docx
@@ -1968,7 +1968,23 @@
           <w:bCs/>
           <w:b/>
         </w:rPr>
-        <w:t xml:space="preserve">Frase deportiva</w:t>
+        <w:t xml:space="preserve">Frase para el aire</w:t>
+      </w:r>
+      <w:r>
+        <w:t xml:space="preserve"> </w:t>
+      </w:r>
+      <w:r>
+        <w:t xml:space="preserve">(la frase célebre del subtema del día, con su autor; el domingo la del subtema 1 y el sábado la del 3) y</w:t>
+      </w:r>
+      <w:r>
+        <w:t xml:space="preserve"> </w:t>
+      </w:r>
+      <w:r>
+        <w:rPr>
+          <w:bCs/>
+          <w:b/>
+        </w:rPr>
+        <w:t xml:space="preserve">frase deportiva</w:t>
       </w:r>
       <w:r>
         <w:t xml:space="preserve"> </w:t>

</xml_diff>

<commit_message>
Mensajero: 104 frases célebres nuevas verificadas (martes y jueves), una frase distinta cada día de lunes a viernes
Co-Authored-By: Claude Opus 5.5 <noreply@anthropic.com>
Claude-Session: https://claude.ai/code/session_012sZjyYY9ZpXrog9pNGjXta
</commit_message>
<xml_diff>
--- a/mensajero/ENTREGA_PROGRAMADOR.docx
+++ b/mensajero/ENTREGA_PROGRAMADOR.docx
@@ -530,7 +530,7 @@
               <w:jc w:val="left"/>
             </w:pPr>
             <w:r>
-              <w:t xml:space="preserve">156</w:t>
+              <w:t xml:space="preserve">260 (3 por semana + una segunda para los subtemas 1 y 2)</w:t>
             </w:r>
           </w:p>
         </w:tc>
@@ -947,7 +947,7 @@
               <w:jc w:val="left"/>
             </w:pPr>
             <w:r>
-              <w:t xml:space="preserve">Semana, Fecha inicio (Dom) dd/mm/aaaa, Color, Tema, Ronda, Enfoque, Subtema 1–3, Desarrollo 1–3, Nota Locutor 1–3, Frase Celebre 1–3 («frase» — Autor), Historia Ilustrativa, Valor (ADN), Programa, Locutor, Versiculo Domingo…Sabado («Cita — texto»), 3 Puntos Domingo…Sabado (uno por línea)</w:t>
+              <w:t xml:space="preserve">Semana, Fecha inicio (Dom) dd/mm/aaaa, Color, Tema, Ronda, Enfoque, Subtema 1–3, Desarrollo 1–3, Nota Locutor 1–3, Frase Celebre 1–3 y 1b–2b («frase» — Autor), Historia Ilustrativa, Valor (ADN), Programa, Locutor, Versiculo Domingo…Sabado («Cita — texto»), 3 Puntos Domingo…Sabado (uno por línea)</w:t>
             </w:r>
           </w:p>
         </w:tc>
@@ -1514,10 +1514,34 @@
         <w:t xml:space="preserve">tools/frases_2027.py</w:t>
       </w:r>
       <w:r>
-        <w:t xml:space="preserve"> </w:t>
-      </w:r>
-      <w:r>
-        <w:t xml:space="preserve">y</w:t>
+        <w:t xml:space="preserve">,</w:t>
+      </w:r>
+      <w:r>
+        <w:t xml:space="preserve"> </w:t>
+      </w:r>
+      <w:r>
+        <w:rPr>
+          <w:rStyle w:val="VerbatimChar"/>
+        </w:rPr>
+        <w:t xml:space="preserve">tools/frases_segundas_2027.py</w:t>
+      </w:r>
+      <w:r>
+        <w:t xml:space="preserve"> </w:t>
+      </w:r>
+      <w:r>
+        <w:t xml:space="preserve">(fuente</w:t>
+      </w:r>
+      <w:r>
+        <w:t xml:space="preserve"> </w:t>
+      </w:r>
+      <w:r>
+        <w:rPr>
+          <w:rStyle w:val="VerbatimChar"/>
+        </w:rPr>
+        <w:t xml:space="preserve">content/frases_2027_b.txt</w:t>
+      </w:r>
+      <w:r>
+        <w:t xml:space="preserve">) y</w:t>
       </w:r>
       <w:r>
         <w:t xml:space="preserve"> </w:t>
@@ -1974,7 +1998,7 @@
         <w:t xml:space="preserve"> </w:t>
       </w:r>
       <w:r>
-        <w:t xml:space="preserve">(la frase célebre del subtema del día, con su autor; el domingo la del subtema 1 y el sábado la del 3) y</w:t>
+        <w:t xml:space="preserve">(frase célebre con su autor, distinta cada día: lunes y miércoles la primera del subtema, martes y jueves la segunda —columnas «Frase Celebre 1b» y «2b»—, viernes la del subtema 3; domingo y sábado no llevan, salvo el programa de un solo día) y</w:t>
       </w:r>
       <w:r>
         <w:t xml:space="preserve"> </w:t>

</xml_diff>

<commit_message>
Versículos: los 14 cambios decididos, con guion reescrito, y fechas especiales
Viernes Santo, Domingo de Pascua y Navidad llevan versículo propio y un aviso «Especial» en la app.

Co-Authored-By: Claude Opus 5.5 <noreply@anthropic.com>
Claude-Session: https://claude.ai/code/session_012sZjyYY9ZpXrog9pNGjXta
</commit_message>
<xml_diff>
--- a/mensajero/ENTREGA_PROGRAMADOR.docx
+++ b/mensajero/ENTREGA_PROGRAMADOR.docx
@@ -2,14 +2,6 @@
 <file path=word/document.xml><?xml version="1.0" encoding="utf-8"?>
 <w:document xmlns:w="http://schemas.openxmlformats.org/wordprocessingml/2006/main" xmlns:m="http://schemas.openxmlformats.org/officeDocument/2006/math" xmlns:r="http://schemas.openxmlformats.org/officeDocument/2006/relationships" xmlns:o="urn:schemas-microsoft-com:office:office" xmlns:v="urn:schemas-microsoft-com:vml" xmlns:w10="urn:schemas-microsoft-com:office:word" xmlns:a="http://schemas.openxmlformats.org/drawingml/2006/main" xmlns:pic="http://schemas.openxmlformats.org/drawingml/2006/picture" xmlns:wp="http://schemas.openxmlformats.org/drawingml/2006/wordprocessingDrawing">
   <w:body>
-    <w:p>
-      <w:pPr>
-        <w:pStyle w:val="Title"/>
-      </w:pPr>
-      <w:r>
-        <w:t xml:space="preserve">Edificando una Cultura 2027 �� Entrega al programador</w:t>
-      </w:r>
-    </w:p>
     <w:bookmarkStart w:id="44" w:name="X181356b963d3dc54b69ddbfd6fcf69747ea0a7f"/>
     <w:p>
       <w:pPr>
@@ -4364,19 +4356,7 @@
         <w:t xml:space="preserve"> </w:t>
       </w:r>
       <w:r>
-        <w:t xml:space="preserve">12 cambios sugeridos esperan la decisión de Richarh (documento «Versículos a corregir 2027»,</w:t>
-      </w:r>
-      <w:r>
-        <w:t xml:space="preserve"> </w:t>
-      </w:r>
-      <w:r>
-        <w:rPr>
-          <w:rStyle w:val="VerbatimChar"/>
-        </w:rPr>
-        <w:t xml:space="preserve">content/versiculos_sugeridos.md</w:t>
-      </w:r>
-      <w:r>
-        <w:t xml:space="preserve">). Los aprobados se aplican con</w:t>
+        <w:t xml:space="preserve">resuelto el 23 oct 2026. Los 18 cambios están aplicados con</w:t>
       </w:r>
       <w:r>
         <w:t xml:space="preserve"> </w:t>
@@ -4388,10 +4368,56 @@
         <w:t xml:space="preserve">tools/versiculos_aplicados_2027.py</w:t>
       </w:r>
       <w:r>
-        <w:t xml:space="preserve"> </w:t>
-      </w:r>
-      <w:r>
-        <w:t xml:space="preserve">y se reescriben esos guiones.</w:t>
+        <w:t xml:space="preserve">, que también reescribe el guion de esos días. Falta solo cotejar con la RVC impresa seis textos que no se pudieron confirmar en línea (Salmo 101:2-3, Mateo 6:3-4, Hageo 1:6-7, 1 Tesalonicenses 2:3-4, Proverbios 16:21 y 1 Corintios 13:3).</w:t>
+      </w:r>
+    </w:p>
+    <w:p>
+      <w:pPr>
+        <w:numPr>
+          <w:ilvl w:val="1"/>
+          <w:numId w:val="1011"/>
+        </w:numPr>
+        <w:pStyle w:val="Compact"/>
+      </w:pPr>
+      <w:r>
+        <w:rPr>
+          <w:bCs/>
+          <w:b/>
+        </w:rPr>
+        <w:t xml:space="preserve">Fechas especiales:</w:t>
+      </w:r>
+      <w:r>
+        <w:t xml:space="preserve"> </w:t>
+      </w:r>
+      <w:r>
+        <w:t xml:space="preserve">Viernes Santo (26 mar), Domingo de Pascua (28 mar) y Navidad (25 dic) tienen versículo propio. La app los marca con un aviso «Especial» en la tarjeta del día y en el guion copiado (constante</w:t>
+      </w:r>
+      <w:r>
+        <w:t xml:space="preserve"> </w:t>
+      </w:r>
+      <w:r>
+        <w:rPr>
+          <w:rStyle w:val="VerbatimChar"/>
+        </w:rPr>
+        <w:t xml:space="preserve">ESPECIALES</w:t>
+      </w:r>
+      <w:r>
+        <w:t xml:space="preserve"> </w:t>
+      </w:r>
+      <w:r>
+        <w:t xml:space="preserve">en</w:t>
+      </w:r>
+      <w:r>
+        <w:t xml:space="preserve"> </w:t>
+      </w:r>
+      <w:r>
+        <w:rPr>
+          <w:rStyle w:val="VerbatimChar"/>
+        </w:rPr>
+        <w:t xml:space="preserve">index.html</w:t>
+      </w:r>
+      <w:r>
+        <w:t xml:space="preserve">, por fecha). Para 2028 hay que actualizar esas fechas.</w:t>
       </w:r>
     </w:p>
     <w:p>
@@ -4801,7 +4827,7 @@
               <w:jc w:val="left"/>
             </w:pPr>
             <w:r>
-              <w:t xml:space="preserve">Versículos por decidir</w:t>
+              <w:t xml:space="preserve">Registro de los cambios de versículo (todos decididos)</w:t>
             </w:r>
           </w:p>
         </w:tc>
@@ -4978,7 +5004,7 @@
       <w:pPr>
         <w:numPr>
           <w:ilvl w:val="0"/>
-          <w:numId w:val="1011"/>
+          <w:numId w:val="1012"/>
         </w:numPr>
         <w:pStyle w:val="Compact"/>
       </w:pPr>
@@ -4990,7 +5016,7 @@
       <w:pPr>
         <w:numPr>
           <w:ilvl w:val="0"/>
-          <w:numId w:val="1011"/>
+          <w:numId w:val="1012"/>
         </w:numPr>
         <w:pStyle w:val="Compact"/>
       </w:pPr>
@@ -5002,7 +5028,7 @@
       <w:pPr>
         <w:numPr>
           <w:ilvl w:val="0"/>
-          <w:numId w:val="1011"/>
+          <w:numId w:val="1012"/>
         </w:numPr>
         <w:pStyle w:val="Compact"/>
       </w:pPr>
@@ -5014,7 +5040,7 @@
       <w:pPr>
         <w:numPr>
           <w:ilvl w:val="0"/>
-          <w:numId w:val="1011"/>
+          <w:numId w:val="1012"/>
         </w:numPr>
         <w:pStyle w:val="Compact"/>
       </w:pPr>
@@ -5379,6 +5405,9 @@
     </w:lvlOverride>
   </w:num>
   <w:num w:numId="1011">
+    <w:abstractNumId w:val="991"/>
+  </w:num>
+  <w:num w:numId="1012">
     <w:abstractNumId w:val="991"/>
   </w:num>
 </w:numbering>

</xml_diff>